<commit_message>
Added feature of 1 in 20 points for pulse_shape.dat
</commit_message>
<xml_diff>
--- a/status-quo-laser8-fs-Si_v2.docx
+++ b/status-quo-laser8-fs-Si_v2.docx
@@ -41,7 +41,7 @@
         <w:widowControl w:val="1"/>
         <w:numPr>
           <w:ilvl w:val="0"/>
-          <w:numId w:val="1"/>
+          <w:numId w:val="2"/>
         </w:numPr>
         <w:pBdr>
           <w:top w:space="0" w:sz="0" w:val="nil"/>
@@ -84,7 +84,7 @@
         <w:widowControl w:val="1"/>
         <w:numPr>
           <w:ilvl w:val="0"/>
-          <w:numId w:val="3"/>
+          <w:numId w:val="4"/>
         </w:numPr>
         <w:pBdr>
           <w:top w:space="0" w:sz="0" w:val="nil"/>
@@ -127,7 +127,7 @@
         <w:widowControl w:val="1"/>
         <w:numPr>
           <w:ilvl w:val="0"/>
-          <w:numId w:val="3"/>
+          <w:numId w:val="4"/>
         </w:numPr>
         <w:pBdr>
           <w:top w:space="0" w:sz="0" w:val="nil"/>
@@ -239,12 +239,12 @@
           <wp:inline distB="0" distT="0" distL="0" distR="0">
             <wp:extent cx="3301938" cy="2195193"/>
             <wp:effectExtent b="0" l="0" r="0" t="0"/>
-            <wp:docPr id="13" name="image13.png"/>
+            <wp:docPr id="13" name="image14.png"/>
             <a:graphic>
               <a:graphicData uri="http://schemas.openxmlformats.org/drawingml/2006/picture">
                 <pic:pic>
                   <pic:nvPicPr>
-                    <pic:cNvPr id="0" name="image13.png"/>
+                    <pic:cNvPr id="0" name="image14.png"/>
                     <pic:cNvPicPr preferRelativeResize="0"/>
                   </pic:nvPicPr>
                   <pic:blipFill>
@@ -286,12 +286,12 @@
             <wp:extent cx="2652642" cy="2032909"/>
             <wp:effectExtent b="0" l="0" r="0" t="0"/>
             <wp:wrapNone/>
-            <wp:docPr id="12" name="image22.png"/>
+            <wp:docPr id="12" name="image12.png"/>
             <a:graphic>
               <a:graphicData uri="http://schemas.openxmlformats.org/drawingml/2006/picture">
                 <pic:pic>
                   <pic:nvPicPr>
-                    <pic:cNvPr id="0" name="image22.png"/>
+                    <pic:cNvPr id="0" name="image12.png"/>
                     <pic:cNvPicPr preferRelativeResize="0"/>
                   </pic:nvPicPr>
                   <pic:blipFill>
@@ -324,7 +324,7 @@
         <w:widowControl w:val="1"/>
         <w:numPr>
           <w:ilvl w:val="0"/>
-          <w:numId w:val="4"/>
+          <w:numId w:val="5"/>
         </w:numPr>
         <w:pBdr>
           <w:top w:space="0" w:sz="0" w:val="nil"/>
@@ -369,12 +369,12 @@
           <wp:inline distB="0" distT="0" distL="0" distR="0">
             <wp:extent cx="3349421" cy="2247241"/>
             <wp:effectExtent b="0" l="0" r="0" t="0"/>
-            <wp:docPr id="15" name="image18.png"/>
+            <wp:docPr id="15" name="image10.png"/>
             <a:graphic>
               <a:graphicData uri="http://schemas.openxmlformats.org/drawingml/2006/picture">
                 <pic:pic>
                   <pic:nvPicPr>
-                    <pic:cNvPr id="0" name="image18.png"/>
+                    <pic:cNvPr id="0" name="image10.png"/>
                     <pic:cNvPicPr preferRelativeResize="0"/>
                   </pic:nvPicPr>
                   <pic:blipFill>
@@ -416,12 +416,12 @@
             <wp:extent cx="2114550" cy="2009775"/>
             <wp:effectExtent b="0" l="0" r="0" t="0"/>
             <wp:wrapNone/>
-            <wp:docPr id="2" name="image9.png"/>
+            <wp:docPr id="2" name="image18.png"/>
             <a:graphic>
               <a:graphicData uri="http://schemas.openxmlformats.org/drawingml/2006/picture">
                 <pic:pic>
                   <pic:nvPicPr>
-                    <pic:cNvPr id="0" name="image9.png"/>
+                    <pic:cNvPr id="0" name="image18.png"/>
                     <pic:cNvPicPr preferRelativeResize="0"/>
                   </pic:nvPicPr>
                   <pic:blipFill>
@@ -454,7 +454,7 @@
         <w:widowControl w:val="1"/>
         <w:numPr>
           <w:ilvl w:val="0"/>
-          <w:numId w:val="2"/>
+          <w:numId w:val="3"/>
         </w:numPr>
         <w:pBdr>
           <w:top w:space="0" w:sz="0" w:val="nil"/>
@@ -550,7 +550,7 @@
         <w:widowControl w:val="1"/>
         <w:numPr>
           <w:ilvl w:val="0"/>
-          <w:numId w:val="5"/>
+          <w:numId w:val="6"/>
         </w:numPr>
         <w:pBdr>
           <w:top w:space="0" w:sz="0" w:val="nil"/>
@@ -606,7 +606,7 @@
         <w:widowControl w:val="1"/>
         <w:numPr>
           <w:ilvl w:val="0"/>
-          <w:numId w:val="5"/>
+          <w:numId w:val="6"/>
         </w:numPr>
         <w:pBdr>
           <w:top w:space="0" w:sz="0" w:val="nil"/>
@@ -739,7 +739,7 @@
         <w:widowControl w:val="1"/>
         <w:numPr>
           <w:ilvl w:val="0"/>
-          <w:numId w:val="3"/>
+          <w:numId w:val="4"/>
         </w:numPr>
         <w:pBdr>
           <w:top w:space="0" w:sz="0" w:val="nil"/>
@@ -789,12 +789,12 @@
           <wp:inline distB="0" distT="0" distL="0" distR="0">
             <wp:extent cx="2952000" cy="1957752"/>
             <wp:effectExtent b="0" l="0" r="0" t="0"/>
-            <wp:docPr id="17" name="image10.png"/>
+            <wp:docPr id="17" name="image6.png"/>
             <a:graphic>
               <a:graphicData uri="http://schemas.openxmlformats.org/drawingml/2006/picture">
                 <pic:pic>
                   <pic:nvPicPr>
-                    <pic:cNvPr id="0" name="image10.png"/>
+                    <pic:cNvPr id="0" name="image6.png"/>
                     <pic:cNvPicPr preferRelativeResize="0"/>
                   </pic:nvPicPr>
                   <pic:blipFill>
@@ -831,12 +831,12 @@
           <wp:inline distB="0" distT="0" distL="0" distR="0">
             <wp:extent cx="2952000" cy="2001190"/>
             <wp:effectExtent b="0" l="0" r="0" t="0"/>
-            <wp:docPr id="16" name="image4.png"/>
+            <wp:docPr id="16" name="image5.png"/>
             <a:graphic>
               <a:graphicData uri="http://schemas.openxmlformats.org/drawingml/2006/picture">
                 <pic:pic>
                   <pic:nvPicPr>
-                    <pic:cNvPr id="0" name="image4.png"/>
+                    <pic:cNvPr id="0" name="image5.png"/>
                     <pic:cNvPicPr preferRelativeResize="0"/>
                   </pic:nvPicPr>
                   <pic:blipFill>
@@ -887,7 +887,7 @@
         <w:widowControl w:val="1"/>
         <w:numPr>
           <w:ilvl w:val="0"/>
-          <w:numId w:val="3"/>
+          <w:numId w:val="4"/>
         </w:numPr>
         <w:pBdr>
           <w:top w:space="0" w:sz="0" w:val="nil"/>
@@ -930,7 +930,7 @@
         <w:widowControl w:val="1"/>
         <w:numPr>
           <w:ilvl w:val="0"/>
-          <w:numId w:val="3"/>
+          <w:numId w:val="4"/>
         </w:numPr>
         <w:pBdr>
           <w:top w:space="0" w:sz="0" w:val="nil"/>
@@ -985,12 +985,12 @@
           <wp:inline distB="0" distT="0" distL="0" distR="0">
             <wp:extent cx="2952000" cy="1978342"/>
             <wp:effectExtent b="0" l="0" r="0" t="0"/>
-            <wp:docPr id="19" name="image1.png"/>
+            <wp:docPr id="19" name="image3.png"/>
             <a:graphic>
               <a:graphicData uri="http://schemas.openxmlformats.org/drawingml/2006/picture">
                 <pic:pic>
                   <pic:nvPicPr>
-                    <pic:cNvPr id="0" name="image1.png"/>
+                    <pic:cNvPr id="0" name="image3.png"/>
                     <pic:cNvPicPr preferRelativeResize="0"/>
                   </pic:nvPicPr>
                   <pic:blipFill>
@@ -1054,12 +1054,12 @@
           <wp:inline distB="0" distT="0" distL="0" distR="0">
             <wp:extent cx="2952000" cy="2077626"/>
             <wp:effectExtent b="0" l="0" r="0" t="0"/>
-            <wp:docPr id="18" name="image7.png"/>
+            <wp:docPr id="18" name="image13.png"/>
             <a:graphic>
               <a:graphicData uri="http://schemas.openxmlformats.org/drawingml/2006/picture">
                 <pic:pic>
                   <pic:nvPicPr>
-                    <pic:cNvPr id="0" name="image7.png"/>
+                    <pic:cNvPr id="0" name="image13.png"/>
                     <pic:cNvPicPr preferRelativeResize="0"/>
                   </pic:nvPicPr>
                   <pic:blipFill>
@@ -1097,7 +1097,7 @@
         <w:widowControl w:val="1"/>
         <w:numPr>
           <w:ilvl w:val="0"/>
-          <w:numId w:val="3"/>
+          <w:numId w:val="4"/>
         </w:numPr>
         <w:pBdr>
           <w:top w:space="0" w:sz="0" w:val="nil"/>
@@ -1254,12 +1254,12 @@
           <wp:inline distB="0" distT="0" distL="0" distR="0">
             <wp:extent cx="2952000" cy="2003163"/>
             <wp:effectExtent b="0" l="0" r="0" t="0"/>
-            <wp:docPr id="20" name="image3.png"/>
+            <wp:docPr id="20" name="image1.png"/>
             <a:graphic>
               <a:graphicData uri="http://schemas.openxmlformats.org/drawingml/2006/picture">
                 <pic:pic>
                   <pic:nvPicPr>
-                    <pic:cNvPr id="0" name="image3.png"/>
+                    <pic:cNvPr id="0" name="image1.png"/>
                     <pic:cNvPicPr preferRelativeResize="0"/>
                   </pic:nvPicPr>
                   <pic:blipFill>
@@ -1297,7 +1297,7 @@
         <w:widowControl w:val="1"/>
         <w:numPr>
           <w:ilvl w:val="0"/>
-          <w:numId w:val="3"/>
+          <w:numId w:val="4"/>
         </w:numPr>
         <w:pBdr>
           <w:top w:space="0" w:sz="0" w:val="nil"/>
@@ -1343,12 +1343,12 @@
           <wp:inline distB="0" distT="0" distL="0" distR="0">
             <wp:extent cx="6645910" cy="4175125"/>
             <wp:effectExtent b="0" l="0" r="0" t="0"/>
-            <wp:docPr id="22" name="image16.png"/>
+            <wp:docPr id="22" name="image15.png"/>
             <a:graphic>
               <a:graphicData uri="http://schemas.openxmlformats.org/drawingml/2006/picture">
                 <pic:pic>
                   <pic:nvPicPr>
-                    <pic:cNvPr id="0" name="image16.png"/>
+                    <pic:cNvPr id="0" name="image15.png"/>
                     <pic:cNvPicPr preferRelativeResize="0"/>
                   </pic:nvPicPr>
                   <pic:blipFill>
@@ -1391,12 +1391,12 @@
             <wp:extent cx="1026942" cy="782176"/>
             <wp:effectExtent b="0" l="0" r="0" t="0"/>
             <wp:wrapNone/>
-            <wp:docPr descr="Imagen que contiene cielo, estrella, agua, colina&#10;&#10;El contenido generado por IA puede ser incorrecto." id="3" name="image5.jpg"/>
+            <wp:docPr descr="Imagen que contiene cielo, estrella, agua, colina&#10;&#10;El contenido generado por IA puede ser incorrecto." id="3" name="image11.jpg"/>
             <a:graphic>
               <a:graphicData uri="http://schemas.openxmlformats.org/drawingml/2006/picture">
                 <pic:pic>
                   <pic:nvPicPr>
-                    <pic:cNvPr descr="Imagen que contiene cielo, estrella, agua, colina&#10;&#10;El contenido generado por IA puede ser incorrecto." id="0" name="image5.jpg"/>
+                    <pic:cNvPr descr="Imagen que contiene cielo, estrella, agua, colina&#10;&#10;El contenido generado por IA puede ser incorrecto." id="0" name="image11.jpg"/>
                     <pic:cNvPicPr preferRelativeResize="0"/>
                   </pic:nvPicPr>
                   <pic:blipFill>
@@ -1509,12 +1509,12 @@
                 <wp:extent cx="1070574" cy="276944"/>
                 <wp:effectExtent b="0" l="0" r="0" t="0"/>
                 <wp:wrapNone/>
-                <wp:docPr id="1" name="image26.png"/>
+                <wp:docPr id="1" name="image28.png"/>
                 <a:graphic>
                   <a:graphicData uri="http://schemas.openxmlformats.org/drawingml/2006/picture">
                     <pic:pic>
                       <pic:nvPicPr>
-                        <pic:cNvPr id="0" name="image26.png"/>
+                        <pic:cNvPr id="0" name="image28.png"/>
                         <pic:cNvPicPr preferRelativeResize="0"/>
                       </pic:nvPicPr>
                       <pic:blipFill>
@@ -1571,7 +1571,7 @@
         <w:widowControl w:val="1"/>
         <w:numPr>
           <w:ilvl w:val="0"/>
-          <w:numId w:val="3"/>
+          <w:numId w:val="4"/>
         </w:numPr>
         <w:pBdr>
           <w:top w:space="0" w:sz="0" w:val="nil"/>
@@ -1617,12 +1617,12 @@
           <wp:inline distB="0" distT="0" distL="0" distR="0">
             <wp:extent cx="2952000" cy="1991035"/>
             <wp:effectExtent b="0" l="0" r="0" t="0"/>
-            <wp:docPr id="23" name="image20.png"/>
+            <wp:docPr id="23" name="image25.png"/>
             <a:graphic>
               <a:graphicData uri="http://schemas.openxmlformats.org/drawingml/2006/picture">
                 <pic:pic>
                   <pic:nvPicPr>
-                    <pic:cNvPr id="0" name="image20.png"/>
+                    <pic:cNvPr id="0" name="image25.png"/>
                     <pic:cNvPicPr preferRelativeResize="0"/>
                   </pic:nvPicPr>
                   <pic:blipFill>
@@ -1659,12 +1659,12 @@
           <wp:inline distB="0" distT="0" distL="0" distR="0">
             <wp:extent cx="2952000" cy="1983983"/>
             <wp:effectExtent b="0" l="0" r="0" t="0"/>
-            <wp:docPr id="24" name="image28.png"/>
+            <wp:docPr id="24" name="image24.png"/>
             <a:graphic>
               <a:graphicData uri="http://schemas.openxmlformats.org/drawingml/2006/picture">
                 <pic:pic>
                   <pic:nvPicPr>
-                    <pic:cNvPr id="0" name="image28.png"/>
+                    <pic:cNvPr id="0" name="image24.png"/>
                     <pic:cNvPicPr preferRelativeResize="0"/>
                   </pic:nvPicPr>
                   <pic:blipFill>
@@ -1702,7 +1702,7 @@
         <w:widowControl w:val="1"/>
         <w:numPr>
           <w:ilvl w:val="0"/>
-          <w:numId w:val="3"/>
+          <w:numId w:val="4"/>
         </w:numPr>
         <w:pBdr>
           <w:top w:space="0" w:sz="0" w:val="nil"/>
@@ -1748,12 +1748,12 @@
           <wp:inline distB="0" distT="0" distL="0" distR="0">
             <wp:extent cx="2952000" cy="1989624"/>
             <wp:effectExtent b="0" l="0" r="0" t="0"/>
-            <wp:docPr id="25" name="image24.png"/>
+            <wp:docPr id="25" name="image22.png"/>
             <a:graphic>
               <a:graphicData uri="http://schemas.openxmlformats.org/drawingml/2006/picture">
                 <pic:pic>
                   <pic:nvPicPr>
-                    <pic:cNvPr id="0" name="image24.png"/>
+                    <pic:cNvPr id="0" name="image22.png"/>
                     <pic:cNvPicPr preferRelativeResize="0"/>
                   </pic:nvPicPr>
                   <pic:blipFill>
@@ -1789,12 +1789,12 @@
           <wp:inline distB="0" distT="0" distL="0" distR="0">
             <wp:extent cx="2952000" cy="2000907"/>
             <wp:effectExtent b="0" l="0" r="0" t="0"/>
-            <wp:docPr id="26" name="image25.png"/>
+            <wp:docPr id="26" name="image21.png"/>
             <a:graphic>
               <a:graphicData uri="http://schemas.openxmlformats.org/drawingml/2006/picture">
                 <pic:pic>
                   <pic:nvPicPr>
-                    <pic:cNvPr id="0" name="image25.png"/>
+                    <pic:cNvPr id="0" name="image21.png"/>
                     <pic:cNvPicPr preferRelativeResize="0"/>
                   </pic:nvPicPr>
                   <pic:blipFill>
@@ -1835,12 +1835,12 @@
           <wp:inline distB="0" distT="0" distL="0" distR="0">
             <wp:extent cx="2952000" cy="1997240"/>
             <wp:effectExtent b="0" l="0" r="0" t="0"/>
-            <wp:docPr id="27" name="image27.png"/>
+            <wp:docPr id="27" name="image26.png"/>
             <a:graphic>
               <a:graphicData uri="http://schemas.openxmlformats.org/drawingml/2006/picture">
                 <pic:pic>
                   <pic:nvPicPr>
-                    <pic:cNvPr id="0" name="image27.png"/>
+                    <pic:cNvPr id="0" name="image26.png"/>
                     <pic:cNvPicPr preferRelativeResize="0"/>
                   </pic:nvPicPr>
                   <pic:blipFill>
@@ -1876,12 +1876,12 @@
           <wp:inline distB="0" distT="0" distL="0" distR="0">
             <wp:extent cx="2952000" cy="1991035"/>
             <wp:effectExtent b="0" l="0" r="0" t="0"/>
-            <wp:docPr id="28" name="image20.png"/>
+            <wp:docPr id="28" name="image25.png"/>
             <a:graphic>
               <a:graphicData uri="http://schemas.openxmlformats.org/drawingml/2006/picture">
                 <pic:pic>
                   <pic:nvPicPr>
-                    <pic:cNvPr id="0" name="image20.png"/>
+                    <pic:cNvPr id="0" name="image25.png"/>
                     <pic:cNvPicPr preferRelativeResize="0"/>
                   </pic:nvPicPr>
                   <pic:blipFill>
@@ -1958,7 +1958,7 @@
         <w:widowControl w:val="1"/>
         <w:numPr>
           <w:ilvl w:val="0"/>
-          <w:numId w:val="3"/>
+          <w:numId w:val="4"/>
         </w:numPr>
         <w:pBdr>
           <w:top w:space="0" w:sz="0" w:val="nil"/>
@@ -2001,7 +2001,7 @@
         <w:widowControl w:val="1"/>
         <w:numPr>
           <w:ilvl w:val="0"/>
-          <w:numId w:val="3"/>
+          <w:numId w:val="4"/>
         </w:numPr>
         <w:pBdr>
           <w:top w:space="0" w:sz="0" w:val="nil"/>
@@ -2062,12 +2062,12 @@
           <wp:inline distB="0" distT="0" distL="0" distR="0">
             <wp:extent cx="2952000" cy="2012471"/>
             <wp:effectExtent b="0" l="0" r="0" t="0"/>
-            <wp:docPr id="29" name="image21.png"/>
+            <wp:docPr id="29" name="image27.png"/>
             <a:graphic>
               <a:graphicData uri="http://schemas.openxmlformats.org/drawingml/2006/picture">
                 <pic:pic>
                   <pic:nvPicPr>
-                    <pic:cNvPr id="0" name="image21.png"/>
+                    <pic:cNvPr id="0" name="image27.png"/>
                     <pic:cNvPicPr preferRelativeResize="0"/>
                   </pic:nvPicPr>
                   <pic:blipFill>
@@ -2103,12 +2103,12 @@
           <wp:inline distB="0" distT="0" distL="0" distR="0">
             <wp:extent cx="2952000" cy="1956624"/>
             <wp:effectExtent b="0" l="0" r="0" t="0"/>
-            <wp:docPr id="4" name="image19.png"/>
+            <wp:docPr id="4" name="image20.png"/>
             <a:graphic>
               <a:graphicData uri="http://schemas.openxmlformats.org/drawingml/2006/picture">
                 <pic:pic>
                   <pic:nvPicPr>
-                    <pic:cNvPr id="0" name="image19.png"/>
+                    <pic:cNvPr id="0" name="image20.png"/>
                     <pic:cNvPicPr preferRelativeResize="0"/>
                   </pic:nvPicPr>
                   <pic:blipFill>
@@ -2152,12 +2152,12 @@
           <wp:inline distB="0" distT="0" distL="0" distR="0">
             <wp:extent cx="2952000" cy="2002035"/>
             <wp:effectExtent b="0" l="0" r="0" t="0"/>
-            <wp:docPr id="5" name="image17.png"/>
+            <wp:docPr id="5" name="image16.png"/>
             <a:graphic>
               <a:graphicData uri="http://schemas.openxmlformats.org/drawingml/2006/picture">
                 <pic:pic>
                   <pic:nvPicPr>
-                    <pic:cNvPr id="0" name="image17.png"/>
+                    <pic:cNvPr id="0" name="image16.png"/>
                     <pic:cNvPicPr preferRelativeResize="0"/>
                   </pic:nvPicPr>
                   <pic:blipFill>
@@ -2193,12 +2193,12 @@
           <wp:inline distB="0" distT="0" distL="0" distR="0">
             <wp:extent cx="2952000" cy="1981445"/>
             <wp:effectExtent b="0" l="0" r="0" t="0"/>
-            <wp:docPr id="6" name="image15.png"/>
+            <wp:docPr id="6" name="image17.png"/>
             <a:graphic>
               <a:graphicData uri="http://schemas.openxmlformats.org/drawingml/2006/picture">
                 <pic:pic>
                   <pic:nvPicPr>
-                    <pic:cNvPr id="0" name="image15.png"/>
+                    <pic:cNvPr id="0" name="image17.png"/>
                     <pic:cNvPicPr preferRelativeResize="0"/>
                   </pic:nvPicPr>
                   <pic:blipFill>
@@ -2254,12 +2254,12 @@
           <wp:inline distB="0" distT="0" distL="0" distR="0">
             <wp:extent cx="2952000" cy="2019522"/>
             <wp:effectExtent b="0" l="0" r="0" t="0"/>
-            <wp:docPr id="7" name="image12.png"/>
+            <wp:docPr id="7" name="image19.png"/>
             <a:graphic>
               <a:graphicData uri="http://schemas.openxmlformats.org/drawingml/2006/picture">
                 <pic:pic>
                   <pic:nvPicPr>
-                    <pic:cNvPr id="0" name="image12.png"/>
+                    <pic:cNvPr id="0" name="image19.png"/>
                     <pic:cNvPicPr preferRelativeResize="0"/>
                   </pic:nvPicPr>
                   <pic:blipFill>
@@ -2295,12 +2295,12 @@
           <wp:inline distB="0" distT="0" distL="0" distR="0">
             <wp:extent cx="2952000" cy="1987368"/>
             <wp:effectExtent b="0" l="0" r="0" t="0"/>
-            <wp:docPr id="8" name="image8.png"/>
+            <wp:docPr id="8" name="image4.png"/>
             <a:graphic>
               <a:graphicData uri="http://schemas.openxmlformats.org/drawingml/2006/picture">
                 <pic:pic>
                   <pic:nvPicPr>
-                    <pic:cNvPr id="0" name="image8.png"/>
+                    <pic:cNvPr id="0" name="image4.png"/>
                     <pic:cNvPicPr preferRelativeResize="0"/>
                   </pic:nvPicPr>
                   <pic:blipFill>
@@ -2367,12 +2367,12 @@
           <wp:inline distB="0" distT="0" distL="0" distR="0">
             <wp:extent cx="2952000" cy="1986240"/>
             <wp:effectExtent b="0" l="0" r="0" t="0"/>
-            <wp:docPr id="9" name="image14.png"/>
+            <wp:docPr id="9" name="image8.png"/>
             <a:graphic>
               <a:graphicData uri="http://schemas.openxmlformats.org/drawingml/2006/picture">
                 <pic:pic>
                   <pic:nvPicPr>
-                    <pic:cNvPr id="0" name="image14.png"/>
+                    <pic:cNvPr id="0" name="image8.png"/>
                     <pic:cNvPicPr preferRelativeResize="0"/>
                   </pic:nvPicPr>
                   <pic:blipFill>
@@ -2409,12 +2409,12 @@
           <wp:inline distB="0" distT="0" distL="0" distR="0">
             <wp:extent cx="2952000" cy="1993009"/>
             <wp:effectExtent b="0" l="0" r="0" t="0"/>
-            <wp:docPr id="10" name="image11.png"/>
+            <wp:docPr id="10" name="image9.png"/>
             <a:graphic>
               <a:graphicData uri="http://schemas.openxmlformats.org/drawingml/2006/picture">
                 <pic:pic>
                   <pic:nvPicPr>
-                    <pic:cNvPr id="0" name="image11.png"/>
+                    <pic:cNvPr id="0" name="image9.png"/>
                     <pic:cNvPicPr preferRelativeResize="0"/>
                   </pic:nvPicPr>
                   <pic:blipFill>
@@ -2805,7 +2805,7 @@
         <w:widowControl w:val="1"/>
         <w:numPr>
           <w:ilvl w:val="0"/>
-          <w:numId w:val="3"/>
+          <w:numId w:val="4"/>
         </w:numPr>
         <w:pBdr>
           <w:top w:space="0" w:sz="0" w:val="nil"/>
@@ -2868,7 +2868,7 @@
         <w:widowControl w:val="1"/>
         <w:numPr>
           <w:ilvl w:val="1"/>
-          <w:numId w:val="3"/>
+          <w:numId w:val="4"/>
         </w:numPr>
         <w:pBdr>
           <w:top w:space="0" w:sz="0" w:val="nil"/>
@@ -2967,7 +2967,7 @@
         <w:rPr>
           <w:rtl w:val="0"/>
         </w:rPr>
-        <w:t xml:space="preserve">Still TODO. Have to clear up changing dt or pulse shape time </w:t>
+        <w:t xml:space="preserve">DONE</w:t>
       </w:r>
     </w:p>
     <w:p>
@@ -3005,7 +3005,7 @@
         <w:widowControl w:val="1"/>
         <w:numPr>
           <w:ilvl w:val="1"/>
-          <w:numId w:val="3"/>
+          <w:numId w:val="4"/>
         </w:numPr>
         <w:pBdr>
           <w:top w:space="0" w:sz="0" w:val="nil"/>
@@ -3088,7 +3088,7 @@
         <w:widowControl w:val="1"/>
         <w:numPr>
           <w:ilvl w:val="1"/>
-          <w:numId w:val="3"/>
+          <w:numId w:val="4"/>
         </w:numPr>
         <w:pBdr>
           <w:top w:space="0" w:sz="0" w:val="nil"/>
@@ -3190,12 +3190,12 @@
           <wp:inline distB="0" distT="0" distL="0" distR="0">
             <wp:extent cx="1647423" cy="1726557"/>
             <wp:effectExtent b="0" l="0" r="0" t="0"/>
-            <wp:docPr id="11" name="image6.png"/>
+            <wp:docPr id="11" name="image7.png"/>
             <a:graphic>
               <a:graphicData uri="http://schemas.openxmlformats.org/drawingml/2006/picture">
                 <pic:pic>
                   <pic:nvPicPr>
-                    <pic:cNvPr id="0" name="image6.png"/>
+                    <pic:cNvPr id="0" name="image7.png"/>
                     <pic:cNvPicPr preferRelativeResize="0"/>
                   </pic:nvPicPr>
                   <pic:blipFill>
@@ -3264,7 +3264,7 @@
         <w:widowControl w:val="1"/>
         <w:numPr>
           <w:ilvl w:val="1"/>
-          <w:numId w:val="3"/>
+          <w:numId w:val="4"/>
         </w:numPr>
         <w:pBdr>
           <w:top w:space="0" w:sz="0" w:val="nil"/>
@@ -3341,7 +3341,7 @@
         <w:widowControl w:val="1"/>
         <w:numPr>
           <w:ilvl w:val="1"/>
-          <w:numId w:val="3"/>
+          <w:numId w:val="4"/>
         </w:numPr>
         <w:pBdr>
           <w:top w:space="0" w:sz="0" w:val="nil"/>
@@ -3392,13 +3392,149 @@
     </w:p>
     <w:p>
       <w:pPr>
+        <w:spacing w:after="0" w:line="240" w:lineRule="auto"/>
+        <w:ind w:left="1080" w:firstLine="0"/>
+        <w:rPr/>
+      </w:pPr>
+      <w:r>
+        <w:rPr>
+          <w:rtl w:val="0"/>
+        </w:rPr>
+        <w:t xml:space="preserve">Time step is defined inside the loop, so it slightly changes over time. Experimentally, the time step slightly increases over time (always stays within 2 and 3e-14).</w:t>
+      </w:r>
+    </w:p>
+    <w:p>
+      <w:pPr>
+        <w:spacing w:after="0" w:line="240" w:lineRule="auto"/>
+        <w:ind w:left="1080" w:firstLine="0"/>
+        <w:rPr/>
+      </w:pPr>
+      <w:r>
+        <w:rPr>
+          <w:rtl w:val="0"/>
+        </w:rPr>
+      </w:r>
+    </w:p>
+    <w:p>
+      <w:pPr>
+        <w:spacing w:after="0" w:line="240" w:lineRule="auto"/>
+        <w:ind w:left="1080" w:firstLine="0"/>
+        <w:rPr/>
+      </w:pPr>
+      <w:r>
+        <w:rPr>
+          <w:rtl w:val="0"/>
+        </w:rPr>
+        <w:t xml:space="preserve">The formula is defined here DT=RATDX2*CPNMAX/K[N-1];</w:t>
+      </w:r>
+    </w:p>
+    <w:p>
+      <w:pPr>
+        <w:spacing w:after="0" w:line="240" w:lineRule="auto"/>
+        <w:ind w:left="1080" w:firstLine="0"/>
+        <w:rPr/>
+      </w:pPr>
+      <w:r>
+        <w:rPr>
+          <w:rtl w:val="0"/>
+        </w:rPr>
+        <w:t xml:space="preserve">With: </w:t>
+      </w:r>
+    </w:p>
+    <w:p>
+      <w:pPr>
+        <w:numPr>
+          <w:ilvl w:val="0"/>
+          <w:numId w:val="1"/>
+        </w:numPr>
+        <w:spacing w:after="0" w:line="240" w:lineRule="auto"/>
+        <w:ind w:left="1440" w:hanging="360"/>
+        <w:rPr>
+          <w:u w:val="none"/>
+        </w:rPr>
+      </w:pPr>
+      <w:r>
+        <w:rPr>
+          <w:rtl w:val="0"/>
+        </w:rPr>
+        <w:t xml:space="preserve">RATDX2 = ½ * DX * DX * RH0;</w:t>
+      </w:r>
+    </w:p>
+    <w:p>
+      <w:pPr>
+        <w:numPr>
+          <w:ilvl w:val="0"/>
+          <w:numId w:val="1"/>
+        </w:numPr>
+        <w:spacing w:after="0" w:line="240" w:lineRule="auto"/>
+        <w:ind w:left="1440" w:hanging="360"/>
+        <w:rPr>
+          <w:u w:val="none"/>
+        </w:rPr>
+      </w:pPr>
+      <w:r>
+        <w:rPr>
+          <w:rtl w:val="0"/>
+        </w:rPr>
+        <w:t xml:space="preserve">CPNMAX=1.00478+E[NMAX -1 ]*(-8.62645e-5-2.51611e-7*E[NMAX  - 1]);</w:t>
+      </w:r>
+    </w:p>
+    <w:p>
+      <w:pPr>
+        <w:numPr>
+          <w:ilvl w:val="0"/>
+          <w:numId w:val="1"/>
+        </w:numPr>
+        <w:spacing w:after="0" w:line="240" w:lineRule="auto"/>
+        <w:ind w:left="1440" w:hanging="360"/>
+        <w:rPr>
+          <w:u w:val="none"/>
+        </w:rPr>
+      </w:pPr>
+      <w:r>
+        <w:rPr>
+          <w:rtl w:val="0"/>
+        </w:rPr>
+        <w:t xml:space="preserve">And K is some array</w:t>
+      </w:r>
+    </w:p>
+    <w:p>
+      <w:pPr>
+        <w:spacing w:after="0" w:line="240" w:lineRule="auto"/>
+        <w:ind w:left="0" w:firstLine="0"/>
+        <w:rPr/>
+      </w:pPr>
+      <w:r>
+        <w:rPr>
+          <w:rtl w:val="0"/>
+        </w:rPr>
+        <w:tab/>
+        <w:t xml:space="preserve">      So basically, it's a quite complicated formula and doesn’t seem easy to change. Not too sure if it would </w:t>
+        <w:tab/>
+        <w:t xml:space="preserve">even help for anything. Should only attempt to be changed as a last resort.</w:t>
+      </w:r>
+    </w:p>
+    <w:p>
+      <w:pPr>
+        <w:spacing w:after="0" w:line="240" w:lineRule="auto"/>
+        <w:ind w:left="1080" w:firstLine="0"/>
+        <w:rPr/>
+      </w:pPr>
+      <w:r>
+        <w:rPr>
+          <w:rtl w:val="0"/>
+        </w:rPr>
+      </w:r>
+    </w:p>
+    <w:p>
+      <w:pPr>
         <w:keepNext w:val="0"/>
         <w:keepLines w:val="0"/>
         <w:pageBreakBefore w:val="0"/>
         <w:widowControl w:val="1"/>
         <w:numPr>
           <w:ilvl w:val="1"/>
-          <w:numId w:val="3"/>
+          <w:numId w:val="4"/>
         </w:numPr>
         <w:pBdr>
           <w:top w:space="0" w:sz="0" w:val="nil"/>
@@ -3462,109 +3598,109 @@
     <w:lvl w:ilvl="0">
       <w:start w:val="1"/>
       <w:numFmt w:val="bullet"/>
-      <w:lvlText w:val="●"/>
-      <w:lvlJc w:val="left"/>
-      <w:pPr>
-        <w:ind w:left="360" w:hanging="360"/>
-      </w:pPr>
-      <w:rPr>
-        <w:rFonts w:ascii="Noto Sans Symbols" w:cs="Noto Sans Symbols" w:eastAsia="Noto Sans Symbols" w:hAnsi="Noto Sans Symbols"/>
+      <w:lvlText w:val="-"/>
+      <w:lvlJc w:val="left"/>
+      <w:pPr>
+        <w:ind w:left="1440" w:hanging="360"/>
+      </w:pPr>
+      <w:rPr>
+        <w:u w:val="none"/>
       </w:rPr>
     </w:lvl>
     <w:lvl w:ilvl="1">
       <w:start w:val="1"/>
       <w:numFmt w:val="bullet"/>
-      <w:lvlText w:val="o"/>
-      <w:lvlJc w:val="left"/>
-      <w:pPr>
-        <w:ind w:left="1080" w:hanging="360"/>
-      </w:pPr>
-      <w:rPr>
-        <w:rFonts w:ascii="Courier New" w:cs="Courier New" w:eastAsia="Courier New" w:hAnsi="Courier New"/>
+      <w:lvlText w:val="-"/>
+      <w:lvlJc w:val="left"/>
+      <w:pPr>
+        <w:ind w:left="2160" w:hanging="360"/>
+      </w:pPr>
+      <w:rPr>
+        <w:u w:val="none"/>
       </w:rPr>
     </w:lvl>
     <w:lvl w:ilvl="2">
       <w:start w:val="1"/>
       <w:numFmt w:val="bullet"/>
-      <w:lvlText w:val="▪"/>
-      <w:lvlJc w:val="left"/>
-      <w:pPr>
-        <w:ind w:left="1800" w:hanging="360"/>
-      </w:pPr>
-      <w:rPr>
-        <w:rFonts w:ascii="Noto Sans Symbols" w:cs="Noto Sans Symbols" w:eastAsia="Noto Sans Symbols" w:hAnsi="Noto Sans Symbols"/>
+      <w:lvlText w:val="-"/>
+      <w:lvlJc w:val="left"/>
+      <w:pPr>
+        <w:ind w:left="2880" w:hanging="360"/>
+      </w:pPr>
+      <w:rPr>
+        <w:u w:val="none"/>
       </w:rPr>
     </w:lvl>
     <w:lvl w:ilvl="3">
       <w:start w:val="1"/>
       <w:numFmt w:val="bullet"/>
-      <w:lvlText w:val="●"/>
-      <w:lvlJc w:val="left"/>
-      <w:pPr>
-        <w:ind w:left="2520" w:hanging="360"/>
-      </w:pPr>
-      <w:rPr>
-        <w:rFonts w:ascii="Noto Sans Symbols" w:cs="Noto Sans Symbols" w:eastAsia="Noto Sans Symbols" w:hAnsi="Noto Sans Symbols"/>
+      <w:lvlText w:val="-"/>
+      <w:lvlJc w:val="left"/>
+      <w:pPr>
+        <w:ind w:left="3600" w:hanging="360"/>
+      </w:pPr>
+      <w:rPr>
+        <w:u w:val="none"/>
       </w:rPr>
     </w:lvl>
     <w:lvl w:ilvl="4">
       <w:start w:val="1"/>
       <w:numFmt w:val="bullet"/>
-      <w:lvlText w:val="o"/>
-      <w:lvlJc w:val="left"/>
-      <w:pPr>
-        <w:ind w:left="3240" w:hanging="360"/>
-      </w:pPr>
-      <w:rPr>
-        <w:rFonts w:ascii="Courier New" w:cs="Courier New" w:eastAsia="Courier New" w:hAnsi="Courier New"/>
+      <w:lvlText w:val="-"/>
+      <w:lvlJc w:val="left"/>
+      <w:pPr>
+        <w:ind w:left="4320" w:hanging="360"/>
+      </w:pPr>
+      <w:rPr>
+        <w:u w:val="none"/>
       </w:rPr>
     </w:lvl>
     <w:lvl w:ilvl="5">
       <w:start w:val="1"/>
       <w:numFmt w:val="bullet"/>
-      <w:lvlText w:val="▪"/>
-      <w:lvlJc w:val="left"/>
-      <w:pPr>
-        <w:ind w:left="3960" w:hanging="360"/>
-      </w:pPr>
-      <w:rPr>
-        <w:rFonts w:ascii="Noto Sans Symbols" w:cs="Noto Sans Symbols" w:eastAsia="Noto Sans Symbols" w:hAnsi="Noto Sans Symbols"/>
+      <w:lvlText w:val="-"/>
+      <w:lvlJc w:val="left"/>
+      <w:pPr>
+        <w:ind w:left="5040" w:hanging="360"/>
+      </w:pPr>
+      <w:rPr>
+        <w:u w:val="none"/>
       </w:rPr>
     </w:lvl>
     <w:lvl w:ilvl="6">
       <w:start w:val="1"/>
       <w:numFmt w:val="bullet"/>
-      <w:lvlText w:val="●"/>
-      <w:lvlJc w:val="left"/>
-      <w:pPr>
-        <w:ind w:left="4680" w:hanging="360"/>
-      </w:pPr>
-      <w:rPr>
-        <w:rFonts w:ascii="Noto Sans Symbols" w:cs="Noto Sans Symbols" w:eastAsia="Noto Sans Symbols" w:hAnsi="Noto Sans Symbols"/>
+      <w:lvlText w:val="-"/>
+      <w:lvlJc w:val="left"/>
+      <w:pPr>
+        <w:ind w:left="5760" w:hanging="360"/>
+      </w:pPr>
+      <w:rPr>
+        <w:u w:val="none"/>
       </w:rPr>
     </w:lvl>
     <w:lvl w:ilvl="7">
       <w:start w:val="1"/>
       <w:numFmt w:val="bullet"/>
-      <w:lvlText w:val="o"/>
-      <w:lvlJc w:val="left"/>
-      <w:pPr>
-        <w:ind w:left="5400" w:hanging="360"/>
-      </w:pPr>
-      <w:rPr>
-        <w:rFonts w:ascii="Courier New" w:cs="Courier New" w:eastAsia="Courier New" w:hAnsi="Courier New"/>
+      <w:lvlText w:val="-"/>
+      <w:lvlJc w:val="left"/>
+      <w:pPr>
+        <w:ind w:left="6480" w:hanging="360"/>
+      </w:pPr>
+      <w:rPr>
+        <w:u w:val="none"/>
       </w:rPr>
     </w:lvl>
     <w:lvl w:ilvl="8">
       <w:start w:val="1"/>
       <w:numFmt w:val="bullet"/>
-      <w:lvlText w:val="▪"/>
-      <w:lvlJc w:val="left"/>
-      <w:pPr>
-        <w:ind w:left="6120" w:hanging="360"/>
-      </w:pPr>
-      <w:rPr>
-        <w:rFonts w:ascii="Noto Sans Symbols" w:cs="Noto Sans Symbols" w:eastAsia="Noto Sans Symbols" w:hAnsi="Noto Sans Symbols"/>
+      <w:lvlText w:val="-"/>
+      <w:lvlJc w:val="left"/>
+      <w:pPr>
+        <w:ind w:left="7200" w:hanging="360"/>
+      </w:pPr>
+      <w:rPr>
+        <w:u w:val="none"/>
       </w:rPr>
     </w:lvl>
   </w:abstractNum>
@@ -3572,7 +3708,7 @@
     <w:lvl w:ilvl="0">
       <w:start w:val="1"/>
       <w:numFmt w:val="bullet"/>
-      <w:lvlText w:val="⮚"/>
+      <w:lvlText w:val="●"/>
       <w:lvlJc w:val="left"/>
       <w:pPr>
         <w:ind w:left="360" w:hanging="360"/>
@@ -3693,13 +3829,15 @@
     </w:lvl>
     <w:lvl w:ilvl="1">
       <w:start w:val="1"/>
-      <w:numFmt w:val="decimal"/>
-      <w:lvlText w:val="%2."/>
+      <w:numFmt w:val="bullet"/>
+      <w:lvlText w:val="o"/>
       <w:lvlJc w:val="left"/>
       <w:pPr>
         <w:ind w:left="1080" w:hanging="360"/>
       </w:pPr>
-      <w:rPr/>
+      <w:rPr>
+        <w:rFonts w:ascii="Courier New" w:cs="Courier New" w:eastAsia="Courier New" w:hAnsi="Courier New"/>
+      </w:rPr>
     </w:lvl>
     <w:lvl w:ilvl="2">
       <w:start w:val="1"/>
@@ -3801,15 +3939,13 @@
     </w:lvl>
     <w:lvl w:ilvl="1">
       <w:start w:val="1"/>
-      <w:numFmt w:val="bullet"/>
-      <w:lvlText w:val="o"/>
+      <w:numFmt w:val="decimal"/>
+      <w:lvlText w:val="%2."/>
       <w:lvlJc w:val="left"/>
       <w:pPr>
         <w:ind w:left="1080" w:hanging="360"/>
       </w:pPr>
-      <w:rPr>
-        <w:rFonts w:ascii="Courier New" w:cs="Courier New" w:eastAsia="Courier New" w:hAnsi="Courier New"/>
-      </w:rPr>
+      <w:rPr/>
     </w:lvl>
     <w:lvl w:ilvl="2">
       <w:start w:val="1"/>
@@ -3897,6 +4033,116 @@
     </w:lvl>
   </w:abstractNum>
   <w:abstractNum w:abstractNumId="5">
+    <w:lvl w:ilvl="0">
+      <w:start w:val="1"/>
+      <w:numFmt w:val="bullet"/>
+      <w:lvlText w:val="⮚"/>
+      <w:lvlJc w:val="left"/>
+      <w:pPr>
+        <w:ind w:left="360" w:hanging="360"/>
+      </w:pPr>
+      <w:rPr>
+        <w:rFonts w:ascii="Noto Sans Symbols" w:cs="Noto Sans Symbols" w:eastAsia="Noto Sans Symbols" w:hAnsi="Noto Sans Symbols"/>
+      </w:rPr>
+    </w:lvl>
+    <w:lvl w:ilvl="1">
+      <w:start w:val="1"/>
+      <w:numFmt w:val="bullet"/>
+      <w:lvlText w:val="o"/>
+      <w:lvlJc w:val="left"/>
+      <w:pPr>
+        <w:ind w:left="1080" w:hanging="360"/>
+      </w:pPr>
+      <w:rPr>
+        <w:rFonts w:ascii="Courier New" w:cs="Courier New" w:eastAsia="Courier New" w:hAnsi="Courier New"/>
+      </w:rPr>
+    </w:lvl>
+    <w:lvl w:ilvl="2">
+      <w:start w:val="1"/>
+      <w:numFmt w:val="bullet"/>
+      <w:lvlText w:val="▪"/>
+      <w:lvlJc w:val="left"/>
+      <w:pPr>
+        <w:ind w:left="1800" w:hanging="360"/>
+      </w:pPr>
+      <w:rPr>
+        <w:rFonts w:ascii="Noto Sans Symbols" w:cs="Noto Sans Symbols" w:eastAsia="Noto Sans Symbols" w:hAnsi="Noto Sans Symbols"/>
+      </w:rPr>
+    </w:lvl>
+    <w:lvl w:ilvl="3">
+      <w:start w:val="1"/>
+      <w:numFmt w:val="bullet"/>
+      <w:lvlText w:val="●"/>
+      <w:lvlJc w:val="left"/>
+      <w:pPr>
+        <w:ind w:left="2520" w:hanging="360"/>
+      </w:pPr>
+      <w:rPr>
+        <w:rFonts w:ascii="Noto Sans Symbols" w:cs="Noto Sans Symbols" w:eastAsia="Noto Sans Symbols" w:hAnsi="Noto Sans Symbols"/>
+      </w:rPr>
+    </w:lvl>
+    <w:lvl w:ilvl="4">
+      <w:start w:val="1"/>
+      <w:numFmt w:val="bullet"/>
+      <w:lvlText w:val="o"/>
+      <w:lvlJc w:val="left"/>
+      <w:pPr>
+        <w:ind w:left="3240" w:hanging="360"/>
+      </w:pPr>
+      <w:rPr>
+        <w:rFonts w:ascii="Courier New" w:cs="Courier New" w:eastAsia="Courier New" w:hAnsi="Courier New"/>
+      </w:rPr>
+    </w:lvl>
+    <w:lvl w:ilvl="5">
+      <w:start w:val="1"/>
+      <w:numFmt w:val="bullet"/>
+      <w:lvlText w:val="▪"/>
+      <w:lvlJc w:val="left"/>
+      <w:pPr>
+        <w:ind w:left="3960" w:hanging="360"/>
+      </w:pPr>
+      <w:rPr>
+        <w:rFonts w:ascii="Noto Sans Symbols" w:cs="Noto Sans Symbols" w:eastAsia="Noto Sans Symbols" w:hAnsi="Noto Sans Symbols"/>
+      </w:rPr>
+    </w:lvl>
+    <w:lvl w:ilvl="6">
+      <w:start w:val="1"/>
+      <w:numFmt w:val="bullet"/>
+      <w:lvlText w:val="●"/>
+      <w:lvlJc w:val="left"/>
+      <w:pPr>
+        <w:ind w:left="4680" w:hanging="360"/>
+      </w:pPr>
+      <w:rPr>
+        <w:rFonts w:ascii="Noto Sans Symbols" w:cs="Noto Sans Symbols" w:eastAsia="Noto Sans Symbols" w:hAnsi="Noto Sans Symbols"/>
+      </w:rPr>
+    </w:lvl>
+    <w:lvl w:ilvl="7">
+      <w:start w:val="1"/>
+      <w:numFmt w:val="bullet"/>
+      <w:lvlText w:val="o"/>
+      <w:lvlJc w:val="left"/>
+      <w:pPr>
+        <w:ind w:left="5400" w:hanging="360"/>
+      </w:pPr>
+      <w:rPr>
+        <w:rFonts w:ascii="Courier New" w:cs="Courier New" w:eastAsia="Courier New" w:hAnsi="Courier New"/>
+      </w:rPr>
+    </w:lvl>
+    <w:lvl w:ilvl="8">
+      <w:start w:val="1"/>
+      <w:numFmt w:val="bullet"/>
+      <w:lvlText w:val="▪"/>
+      <w:lvlJc w:val="left"/>
+      <w:pPr>
+        <w:ind w:left="6120" w:hanging="360"/>
+      </w:pPr>
+      <w:rPr>
+        <w:rFonts w:ascii="Noto Sans Symbols" w:cs="Noto Sans Symbols" w:eastAsia="Noto Sans Symbols" w:hAnsi="Noto Sans Symbols"/>
+      </w:rPr>
+    </w:lvl>
+  </w:abstractNum>
+  <w:abstractNum w:abstractNumId="6">
     <w:lvl w:ilvl="0">
       <w:start w:val="0"/>
       <w:numFmt w:val="bullet"/>
@@ -4020,6 +4266,9 @@
   </w:num>
   <w:num w:numId="5">
     <w:abstractNumId w:val="5"/>
+  </w:num>
+  <w:num w:numId="6">
+    <w:abstractNumId w:val="6"/>
   </w:num>
 </w:numbering>
 </file>

</xml_diff>

<commit_message>
Fixed issues with heatmap render
</commit_message>
<xml_diff>
--- a/status-quo-laser8-fs-Si_v2.docx
+++ b/status-quo-laser8-fs-Si_v2.docx
@@ -239,12 +239,12 @@
           <wp:inline distB="0" distT="0" distL="0" distR="0">
             <wp:extent cx="3301938" cy="2195193"/>
             <wp:effectExtent b="0" l="0" r="0" t="0"/>
-            <wp:docPr id="13" name="image14.png"/>
+            <wp:docPr id="13" name="image12.png"/>
             <a:graphic>
               <a:graphicData uri="http://schemas.openxmlformats.org/drawingml/2006/picture">
                 <pic:pic>
                   <pic:nvPicPr>
-                    <pic:cNvPr id="0" name="image14.png"/>
+                    <pic:cNvPr id="0" name="image12.png"/>
                     <pic:cNvPicPr preferRelativeResize="0"/>
                   </pic:nvPicPr>
                   <pic:blipFill>
@@ -286,12 +286,12 @@
             <wp:extent cx="2652642" cy="2032909"/>
             <wp:effectExtent b="0" l="0" r="0" t="0"/>
             <wp:wrapNone/>
-            <wp:docPr id="12" name="image12.png"/>
+            <wp:docPr id="12" name="image11.png"/>
             <a:graphic>
               <a:graphicData uri="http://schemas.openxmlformats.org/drawingml/2006/picture">
                 <pic:pic>
                   <pic:nvPicPr>
-                    <pic:cNvPr id="0" name="image12.png"/>
+                    <pic:cNvPr id="0" name="image11.png"/>
                     <pic:cNvPicPr preferRelativeResize="0"/>
                   </pic:nvPicPr>
                   <pic:blipFill>
@@ -369,12 +369,12 @@
           <wp:inline distB="0" distT="0" distL="0" distR="0">
             <wp:extent cx="3349421" cy="2247241"/>
             <wp:effectExtent b="0" l="0" r="0" t="0"/>
-            <wp:docPr id="15" name="image10.png"/>
+            <wp:docPr id="15" name="image14.png"/>
             <a:graphic>
               <a:graphicData uri="http://schemas.openxmlformats.org/drawingml/2006/picture">
                 <pic:pic>
                   <pic:nvPicPr>
-                    <pic:cNvPr id="0" name="image10.png"/>
+                    <pic:cNvPr id="0" name="image14.png"/>
                     <pic:cNvPicPr preferRelativeResize="0"/>
                   </pic:nvPicPr>
                   <pic:blipFill>
@@ -416,12 +416,12 @@
             <wp:extent cx="2114550" cy="2009775"/>
             <wp:effectExtent b="0" l="0" r="0" t="0"/>
             <wp:wrapNone/>
-            <wp:docPr id="2" name="image18.png"/>
+            <wp:docPr id="2" name="image1.png"/>
             <a:graphic>
               <a:graphicData uri="http://schemas.openxmlformats.org/drawingml/2006/picture">
                 <pic:pic>
                   <pic:nvPicPr>
-                    <pic:cNvPr id="0" name="image18.png"/>
+                    <pic:cNvPr id="0" name="image1.png"/>
                     <pic:cNvPicPr preferRelativeResize="0"/>
                   </pic:nvPicPr>
                   <pic:blipFill>
@@ -666,12 +666,12 @@
           <wp:inline distB="0" distT="0" distL="0" distR="0">
             <wp:extent cx="3139903" cy="2121370"/>
             <wp:effectExtent b="0" l="0" r="0" t="0"/>
-            <wp:docPr id="14" name="image2.png"/>
+            <wp:docPr id="14" name="image13.png"/>
             <a:graphic>
               <a:graphicData uri="http://schemas.openxmlformats.org/drawingml/2006/picture">
                 <pic:pic>
                   <pic:nvPicPr>
-                    <pic:cNvPr id="0" name="image2.png"/>
+                    <pic:cNvPr id="0" name="image13.png"/>
                     <pic:cNvPicPr preferRelativeResize="0"/>
                   </pic:nvPicPr>
                   <pic:blipFill>
@@ -789,12 +789,12 @@
           <wp:inline distB="0" distT="0" distL="0" distR="0">
             <wp:extent cx="2952000" cy="1957752"/>
             <wp:effectExtent b="0" l="0" r="0" t="0"/>
-            <wp:docPr id="17" name="image6.png"/>
+            <wp:docPr id="17" name="image15.png"/>
             <a:graphic>
               <a:graphicData uri="http://schemas.openxmlformats.org/drawingml/2006/picture">
                 <pic:pic>
                   <pic:nvPicPr>
-                    <pic:cNvPr id="0" name="image6.png"/>
+                    <pic:cNvPr id="0" name="image15.png"/>
                     <pic:cNvPicPr preferRelativeResize="0"/>
                   </pic:nvPicPr>
                   <pic:blipFill>
@@ -831,12 +831,12 @@
           <wp:inline distB="0" distT="0" distL="0" distR="0">
             <wp:extent cx="2952000" cy="2001190"/>
             <wp:effectExtent b="0" l="0" r="0" t="0"/>
-            <wp:docPr id="16" name="image5.png"/>
+            <wp:docPr id="16" name="image16.png"/>
             <a:graphic>
               <a:graphicData uri="http://schemas.openxmlformats.org/drawingml/2006/picture">
                 <pic:pic>
                   <pic:nvPicPr>
-                    <pic:cNvPr id="0" name="image5.png"/>
+                    <pic:cNvPr id="0" name="image16.png"/>
                     <pic:cNvPicPr preferRelativeResize="0"/>
                   </pic:nvPicPr>
                   <pic:blipFill>
@@ -985,12 +985,12 @@
           <wp:inline distB="0" distT="0" distL="0" distR="0">
             <wp:extent cx="2952000" cy="1978342"/>
             <wp:effectExtent b="0" l="0" r="0" t="0"/>
-            <wp:docPr id="19" name="image3.png"/>
+            <wp:docPr id="19" name="image18.png"/>
             <a:graphic>
               <a:graphicData uri="http://schemas.openxmlformats.org/drawingml/2006/picture">
                 <pic:pic>
                   <pic:nvPicPr>
-                    <pic:cNvPr id="0" name="image3.png"/>
+                    <pic:cNvPr id="0" name="image18.png"/>
                     <pic:cNvPicPr preferRelativeResize="0"/>
                   </pic:nvPicPr>
                   <pic:blipFill>
@@ -1054,12 +1054,12 @@
           <wp:inline distB="0" distT="0" distL="0" distR="0">
             <wp:extent cx="2952000" cy="2077626"/>
             <wp:effectExtent b="0" l="0" r="0" t="0"/>
-            <wp:docPr id="18" name="image13.png"/>
+            <wp:docPr id="18" name="image17.png"/>
             <a:graphic>
               <a:graphicData uri="http://schemas.openxmlformats.org/drawingml/2006/picture">
                 <pic:pic>
                   <pic:nvPicPr>
-                    <pic:cNvPr id="0" name="image13.png"/>
+                    <pic:cNvPr id="0" name="image17.png"/>
                     <pic:cNvPicPr preferRelativeResize="0"/>
                   </pic:nvPicPr>
                   <pic:blipFill>
@@ -1185,12 +1185,12 @@
           <wp:inline distB="0" distT="0" distL="0" distR="0">
             <wp:extent cx="2952000" cy="2008239"/>
             <wp:effectExtent b="0" l="0" r="0" t="0"/>
-            <wp:docPr id="21" name="image23.png"/>
+            <wp:docPr id="21" name="image20.png"/>
             <a:graphic>
               <a:graphicData uri="http://schemas.openxmlformats.org/drawingml/2006/picture">
                 <pic:pic>
                   <pic:nvPicPr>
-                    <pic:cNvPr id="0" name="image23.png"/>
+                    <pic:cNvPr id="0" name="image20.png"/>
                     <pic:cNvPicPr preferRelativeResize="0"/>
                   </pic:nvPicPr>
                   <pic:blipFill>
@@ -1254,12 +1254,12 @@
           <wp:inline distB="0" distT="0" distL="0" distR="0">
             <wp:extent cx="2952000" cy="2003163"/>
             <wp:effectExtent b="0" l="0" r="0" t="0"/>
-            <wp:docPr id="20" name="image1.png"/>
+            <wp:docPr id="20" name="image19.png"/>
             <a:graphic>
               <a:graphicData uri="http://schemas.openxmlformats.org/drawingml/2006/picture">
                 <pic:pic>
                   <pic:nvPicPr>
-                    <pic:cNvPr id="0" name="image1.png"/>
+                    <pic:cNvPr id="0" name="image19.png"/>
                     <pic:cNvPicPr preferRelativeResize="0"/>
                   </pic:nvPicPr>
                   <pic:blipFill>
@@ -1343,12 +1343,12 @@
           <wp:inline distB="0" distT="0" distL="0" distR="0">
             <wp:extent cx="6645910" cy="4175125"/>
             <wp:effectExtent b="0" l="0" r="0" t="0"/>
-            <wp:docPr id="22" name="image15.png"/>
+            <wp:docPr id="22" name="image21.png"/>
             <a:graphic>
               <a:graphicData uri="http://schemas.openxmlformats.org/drawingml/2006/picture">
                 <pic:pic>
                   <pic:nvPicPr>
-                    <pic:cNvPr id="0" name="image15.png"/>
+                    <pic:cNvPr id="0" name="image21.png"/>
                     <pic:cNvPicPr preferRelativeResize="0"/>
                   </pic:nvPicPr>
                   <pic:blipFill>
@@ -1391,12 +1391,12 @@
             <wp:extent cx="1026942" cy="782176"/>
             <wp:effectExtent b="0" l="0" r="0" t="0"/>
             <wp:wrapNone/>
-            <wp:docPr descr="Imagen que contiene cielo, estrella, agua, colina&#10;&#10;El contenido generado por IA puede ser incorrecto." id="3" name="image11.jpg"/>
+            <wp:docPr descr="Imagen que contiene cielo, estrella, agua, colina&#10;&#10;El contenido generado por IA puede ser incorrecto." id="3" name="image3.jpg"/>
             <a:graphic>
               <a:graphicData uri="http://schemas.openxmlformats.org/drawingml/2006/picture">
                 <pic:pic>
                   <pic:nvPicPr>
-                    <pic:cNvPr descr="Imagen que contiene cielo, estrella, agua, colina&#10;&#10;El contenido generado por IA puede ser incorrecto." id="0" name="image11.jpg"/>
+                    <pic:cNvPr descr="Imagen que contiene cielo, estrella, agua, colina&#10;&#10;El contenido generado por IA puede ser incorrecto." id="0" name="image3.jpg"/>
                     <pic:cNvPicPr preferRelativeResize="0"/>
                   </pic:nvPicPr>
                   <pic:blipFill>
@@ -1509,12 +1509,12 @@
                 <wp:extent cx="1070574" cy="276944"/>
                 <wp:effectExtent b="0" l="0" r="0" t="0"/>
                 <wp:wrapNone/>
-                <wp:docPr id="1" name="image28.png"/>
+                <wp:docPr id="1" name="image22.png"/>
                 <a:graphic>
                   <a:graphicData uri="http://schemas.openxmlformats.org/drawingml/2006/picture">
                     <pic:pic>
                       <pic:nvPicPr>
-                        <pic:cNvPr id="0" name="image28.png"/>
+                        <pic:cNvPr id="0" name="image22.png"/>
                         <pic:cNvPicPr preferRelativeResize="0"/>
                       </pic:nvPicPr>
                       <pic:blipFill>
@@ -1617,12 +1617,12 @@
           <wp:inline distB="0" distT="0" distL="0" distR="0">
             <wp:extent cx="2952000" cy="1991035"/>
             <wp:effectExtent b="0" l="0" r="0" t="0"/>
-            <wp:docPr id="23" name="image25.png"/>
+            <wp:docPr id="23" name="image23.png"/>
             <a:graphic>
               <a:graphicData uri="http://schemas.openxmlformats.org/drawingml/2006/picture">
                 <pic:pic>
                   <pic:nvPicPr>
-                    <pic:cNvPr id="0" name="image25.png"/>
+                    <pic:cNvPr id="0" name="image23.png"/>
                     <pic:cNvPicPr preferRelativeResize="0"/>
                   </pic:nvPicPr>
                   <pic:blipFill>
@@ -1748,12 +1748,12 @@
           <wp:inline distB="0" distT="0" distL="0" distR="0">
             <wp:extent cx="2952000" cy="1989624"/>
             <wp:effectExtent b="0" l="0" r="0" t="0"/>
-            <wp:docPr id="25" name="image22.png"/>
+            <wp:docPr id="25" name="image25.png"/>
             <a:graphic>
               <a:graphicData uri="http://schemas.openxmlformats.org/drawingml/2006/picture">
                 <pic:pic>
                   <pic:nvPicPr>
-                    <pic:cNvPr id="0" name="image22.png"/>
+                    <pic:cNvPr id="0" name="image25.png"/>
                     <pic:cNvPicPr preferRelativeResize="0"/>
                   </pic:nvPicPr>
                   <pic:blipFill>
@@ -1789,12 +1789,12 @@
           <wp:inline distB="0" distT="0" distL="0" distR="0">
             <wp:extent cx="2952000" cy="2000907"/>
             <wp:effectExtent b="0" l="0" r="0" t="0"/>
-            <wp:docPr id="26" name="image21.png"/>
+            <wp:docPr id="26" name="image26.png"/>
             <a:graphic>
               <a:graphicData uri="http://schemas.openxmlformats.org/drawingml/2006/picture">
                 <pic:pic>
                   <pic:nvPicPr>
-                    <pic:cNvPr id="0" name="image21.png"/>
+                    <pic:cNvPr id="0" name="image26.png"/>
                     <pic:cNvPicPr preferRelativeResize="0"/>
                   </pic:nvPicPr>
                   <pic:blipFill>
@@ -1835,12 +1835,12 @@
           <wp:inline distB="0" distT="0" distL="0" distR="0">
             <wp:extent cx="2952000" cy="1997240"/>
             <wp:effectExtent b="0" l="0" r="0" t="0"/>
-            <wp:docPr id="27" name="image26.png"/>
+            <wp:docPr id="27" name="image28.png"/>
             <a:graphic>
               <a:graphicData uri="http://schemas.openxmlformats.org/drawingml/2006/picture">
                 <pic:pic>
                   <pic:nvPicPr>
-                    <pic:cNvPr id="0" name="image26.png"/>
+                    <pic:cNvPr id="0" name="image28.png"/>
                     <pic:cNvPicPr preferRelativeResize="0"/>
                   </pic:nvPicPr>
                   <pic:blipFill>
@@ -1876,12 +1876,12 @@
           <wp:inline distB="0" distT="0" distL="0" distR="0">
             <wp:extent cx="2952000" cy="1991035"/>
             <wp:effectExtent b="0" l="0" r="0" t="0"/>
-            <wp:docPr id="28" name="image25.png"/>
+            <wp:docPr id="28" name="image23.png"/>
             <a:graphic>
               <a:graphicData uri="http://schemas.openxmlformats.org/drawingml/2006/picture">
                 <pic:pic>
                   <pic:nvPicPr>
-                    <pic:cNvPr id="0" name="image25.png"/>
+                    <pic:cNvPr id="0" name="image23.png"/>
                     <pic:cNvPicPr preferRelativeResize="0"/>
                   </pic:nvPicPr>
                   <pic:blipFill>
@@ -2103,12 +2103,12 @@
           <wp:inline distB="0" distT="0" distL="0" distR="0">
             <wp:extent cx="2952000" cy="1956624"/>
             <wp:effectExtent b="0" l="0" r="0" t="0"/>
-            <wp:docPr id="4" name="image20.png"/>
+            <wp:docPr id="4" name="image2.png"/>
             <a:graphic>
               <a:graphicData uri="http://schemas.openxmlformats.org/drawingml/2006/picture">
                 <pic:pic>
                   <pic:nvPicPr>
-                    <pic:cNvPr id="0" name="image20.png"/>
+                    <pic:cNvPr id="0" name="image2.png"/>
                     <pic:cNvPicPr preferRelativeResize="0"/>
                   </pic:nvPicPr>
                   <pic:blipFill>
@@ -2152,12 +2152,12 @@
           <wp:inline distB="0" distT="0" distL="0" distR="0">
             <wp:extent cx="2952000" cy="2002035"/>
             <wp:effectExtent b="0" l="0" r="0" t="0"/>
-            <wp:docPr id="5" name="image16.png"/>
+            <wp:docPr id="5" name="image4.png"/>
             <a:graphic>
               <a:graphicData uri="http://schemas.openxmlformats.org/drawingml/2006/picture">
                 <pic:pic>
                   <pic:nvPicPr>
-                    <pic:cNvPr id="0" name="image16.png"/>
+                    <pic:cNvPr id="0" name="image4.png"/>
                     <pic:cNvPicPr preferRelativeResize="0"/>
                   </pic:nvPicPr>
                   <pic:blipFill>
@@ -2193,12 +2193,12 @@
           <wp:inline distB="0" distT="0" distL="0" distR="0">
             <wp:extent cx="2952000" cy="1981445"/>
             <wp:effectExtent b="0" l="0" r="0" t="0"/>
-            <wp:docPr id="6" name="image17.png"/>
+            <wp:docPr id="6" name="image5.png"/>
             <a:graphic>
               <a:graphicData uri="http://schemas.openxmlformats.org/drawingml/2006/picture">
                 <pic:pic>
                   <pic:nvPicPr>
-                    <pic:cNvPr id="0" name="image17.png"/>
+                    <pic:cNvPr id="0" name="image5.png"/>
                     <pic:cNvPicPr preferRelativeResize="0"/>
                   </pic:nvPicPr>
                   <pic:blipFill>
@@ -2254,12 +2254,12 @@
           <wp:inline distB="0" distT="0" distL="0" distR="0">
             <wp:extent cx="2952000" cy="2019522"/>
             <wp:effectExtent b="0" l="0" r="0" t="0"/>
-            <wp:docPr id="7" name="image19.png"/>
+            <wp:docPr id="7" name="image8.png"/>
             <a:graphic>
               <a:graphicData uri="http://schemas.openxmlformats.org/drawingml/2006/picture">
                 <pic:pic>
                   <pic:nvPicPr>
-                    <pic:cNvPr id="0" name="image19.png"/>
+                    <pic:cNvPr id="0" name="image8.png"/>
                     <pic:cNvPicPr preferRelativeResize="0"/>
                   </pic:nvPicPr>
                   <pic:blipFill>
@@ -2295,12 +2295,12 @@
           <wp:inline distB="0" distT="0" distL="0" distR="0">
             <wp:extent cx="2952000" cy="1987368"/>
             <wp:effectExtent b="0" l="0" r="0" t="0"/>
-            <wp:docPr id="8" name="image4.png"/>
+            <wp:docPr id="8" name="image7.png"/>
             <a:graphic>
               <a:graphicData uri="http://schemas.openxmlformats.org/drawingml/2006/picture">
                 <pic:pic>
                   <pic:nvPicPr>
-                    <pic:cNvPr id="0" name="image4.png"/>
+                    <pic:cNvPr id="0" name="image7.png"/>
                     <pic:cNvPicPr preferRelativeResize="0"/>
                   </pic:nvPicPr>
                   <pic:blipFill>
@@ -2367,12 +2367,12 @@
           <wp:inline distB="0" distT="0" distL="0" distR="0">
             <wp:extent cx="2952000" cy="1986240"/>
             <wp:effectExtent b="0" l="0" r="0" t="0"/>
-            <wp:docPr id="9" name="image8.png"/>
+            <wp:docPr id="9" name="image6.png"/>
             <a:graphic>
               <a:graphicData uri="http://schemas.openxmlformats.org/drawingml/2006/picture">
                 <pic:pic>
                   <pic:nvPicPr>
-                    <pic:cNvPr id="0" name="image8.png"/>
+                    <pic:cNvPr id="0" name="image6.png"/>
                     <pic:cNvPicPr preferRelativeResize="0"/>
                   </pic:nvPicPr>
                   <pic:blipFill>
@@ -2987,9 +2987,7 @@
         <w:spacing w:after="0" w:before="0" w:line="240" w:lineRule="auto"/>
         <w:ind w:left="1080" w:right="0" w:firstLine="0"/>
         <w:jc w:val="left"/>
-        <w:rPr>
-          <w:color w:val="ff0000"/>
-        </w:rPr>
+        <w:rPr/>
       </w:pPr>
       <w:r>
         <w:rPr>
@@ -3188,14 +3186,14 @@
         </w:rPr>
         <w:drawing>
           <wp:inline distB="0" distT="0" distL="0" distR="0">
-            <wp:extent cx="1647423" cy="1726557"/>
+            <wp:extent cx="4824413" cy="5047507"/>
             <wp:effectExtent b="0" l="0" r="0" t="0"/>
-            <wp:docPr id="11" name="image7.png"/>
+            <wp:docPr id="11" name="image10.png"/>
             <a:graphic>
               <a:graphicData uri="http://schemas.openxmlformats.org/drawingml/2006/picture">
                 <pic:pic>
                   <pic:nvPicPr>
-                    <pic:cNvPr id="0" name="image7.png"/>
+                    <pic:cNvPr id="0" name="image10.png"/>
                     <pic:cNvPicPr preferRelativeResize="0"/>
                   </pic:nvPicPr>
                   <pic:blipFill>
@@ -3208,7 +3206,7 @@
                   <pic:spPr>
                     <a:xfrm>
                       <a:off x="0" y="0"/>
-                      <a:ext cx="1647423" cy="1726557"/>
+                      <a:ext cx="4824413" cy="5047507"/>
                     </a:xfrm>
                     <a:prstGeom prst="rect"/>
                     <a:ln/>
@@ -3249,6 +3247,83 @@
           <w:rtl w:val="0"/>
         </w:rPr>
         <w:t xml:space="preserve">DONE. state_visualization.py. Colors can be changed in the first lines of the code</w:t>
+      </w:r>
+    </w:p>
+    <w:p>
+      <w:pPr>
+        <w:keepNext w:val="0"/>
+        <w:keepLines w:val="0"/>
+        <w:pageBreakBefore w:val="0"/>
+        <w:widowControl w:val="1"/>
+        <w:pBdr>
+          <w:top w:space="0" w:sz="0" w:val="nil"/>
+          <w:left w:space="0" w:sz="0" w:val="nil"/>
+          <w:bottom w:space="0" w:sz="0" w:val="nil"/>
+          <w:right w:space="0" w:sz="0" w:val="nil"/>
+          <w:between w:space="0" w:sz="0" w:val="nil"/>
+        </w:pBdr>
+        <w:shd w:fill="auto" w:val="clear"/>
+        <w:spacing w:after="0" w:before="0" w:line="240" w:lineRule="auto"/>
+        <w:ind w:left="1080" w:right="0" w:firstLine="0"/>
+        <w:jc w:val="left"/>
+        <w:rPr/>
+      </w:pPr>
+      <w:r>
+        <w:rPr>
+          <w:rtl w:val="0"/>
+        </w:rPr>
+      </w:r>
+    </w:p>
+    <w:p>
+      <w:pPr>
+        <w:keepNext w:val="0"/>
+        <w:keepLines w:val="0"/>
+        <w:pageBreakBefore w:val="0"/>
+        <w:widowControl w:val="1"/>
+        <w:pBdr>
+          <w:top w:space="0" w:sz="0" w:val="nil"/>
+          <w:left w:space="0" w:sz="0" w:val="nil"/>
+          <w:bottom w:space="0" w:sz="0" w:val="nil"/>
+          <w:right w:space="0" w:sz="0" w:val="nil"/>
+          <w:between w:space="0" w:sz="0" w:val="nil"/>
+        </w:pBdr>
+        <w:shd w:fill="auto" w:val="clear"/>
+        <w:spacing w:after="0" w:before="0" w:line="240" w:lineRule="auto"/>
+        <w:ind w:left="1080" w:right="0" w:firstLine="0"/>
+        <w:jc w:val="left"/>
+        <w:rPr/>
+      </w:pPr>
+      <w:r>
+        <w:rPr>
+          <w:rtl w:val="0"/>
+        </w:rPr>
+        <w:t xml:space="preserve">Hacer el texto mas grande. Depth directly in nanometer, time in nanoseconds.</w:t>
+      </w:r>
+    </w:p>
+    <w:p>
+      <w:pPr>
+        <w:keepNext w:val="0"/>
+        <w:keepLines w:val="0"/>
+        <w:pageBreakBefore w:val="0"/>
+        <w:widowControl w:val="1"/>
+        <w:pBdr>
+          <w:top w:space="0" w:sz="0" w:val="nil"/>
+          <w:left w:space="0" w:sz="0" w:val="nil"/>
+          <w:bottom w:space="0" w:sz="0" w:val="nil"/>
+          <w:right w:space="0" w:sz="0" w:val="nil"/>
+          <w:between w:space="0" w:sz="0" w:val="nil"/>
+        </w:pBdr>
+        <w:shd w:fill="auto" w:val="clear"/>
+        <w:spacing w:after="0" w:before="0" w:line="240" w:lineRule="auto"/>
+        <w:ind w:left="1080" w:right="0" w:firstLine="0"/>
+        <w:jc w:val="left"/>
+        <w:rPr/>
+      </w:pPr>
+      <w:r>
+        <w:rPr>
+          <w:rtl w:val="0"/>
+        </w:rPr>
+        <w:t xml:space="preserve">Change aspect ratio and make legend look good on regular screens.</w:t>
       </w:r>
       <w:r>
         <w:rPr>
@@ -3317,9 +3392,7 @@
       <w:pPr>
         <w:spacing w:after="0" w:line="240" w:lineRule="auto"/>
         <w:ind w:left="1080" w:firstLine="0"/>
-        <w:rPr>
-          <w:color w:val="ff0000"/>
-        </w:rPr>
+        <w:rPr/>
       </w:pPr>
       <w:r>
         <w:rPr>
@@ -3327,10 +3400,31 @@
         </w:rPr>
         <w:t xml:space="preserve">Semi DONE. heatmap.py. </w:t>
       </w:r>
-      <w:r>
-        <w:rPr>
-          <w:rtl w:val="0"/>
-        </w:rPr>
+    </w:p>
+    <w:p>
+      <w:pPr>
+        <w:spacing w:after="0" w:line="240" w:lineRule="auto"/>
+        <w:ind w:left="1080" w:firstLine="0"/>
+        <w:rPr/>
+      </w:pPr>
+      <w:r>
+        <w:rPr>
+          <w:rtl w:val="0"/>
+        </w:rPr>
+        <w:t xml:space="preserve">Same changes as in the above.</w:t>
+      </w:r>
+    </w:p>
+    <w:p>
+      <w:pPr>
+        <w:spacing w:after="0" w:line="240" w:lineRule="auto"/>
+        <w:ind w:left="1080" w:firstLine="0"/>
+        <w:rPr/>
+      </w:pPr>
+      <w:r>
+        <w:rPr>
+          <w:rtl w:val="0"/>
+        </w:rPr>
+        <w:t xml:space="preserve">Apply lookup table for better rendering.</w:t>
       </w:r>
     </w:p>
     <w:p>

</xml_diff>

<commit_message>
Set manual thresholds for LUT values
</commit_message>
<xml_diff>
--- a/status-quo-laser8-fs-Si_v2.docx
+++ b/status-quo-laser8-fs-Si_v2.docx
@@ -239,12 +239,12 @@
           <wp:inline distB="0" distT="0" distL="0" distR="0">
             <wp:extent cx="3301938" cy="2195193"/>
             <wp:effectExtent b="0" l="0" r="0" t="0"/>
-            <wp:docPr id="13" name="image1.png"/>
+            <wp:docPr id="13" name="image12.png"/>
             <a:graphic>
               <a:graphicData uri="http://schemas.openxmlformats.org/drawingml/2006/picture">
                 <pic:pic>
                   <pic:nvPicPr>
-                    <pic:cNvPr id="0" name="image1.png"/>
+                    <pic:cNvPr id="0" name="image12.png"/>
                     <pic:cNvPicPr preferRelativeResize="0"/>
                   </pic:nvPicPr>
                   <pic:blipFill>
@@ -286,12 +286,12 @@
             <wp:extent cx="2652642" cy="2032909"/>
             <wp:effectExtent b="0" l="0" r="0" t="0"/>
             <wp:wrapNone/>
-            <wp:docPr id="12" name="image3.png"/>
+            <wp:docPr id="12" name="image8.png"/>
             <a:graphic>
               <a:graphicData uri="http://schemas.openxmlformats.org/drawingml/2006/picture">
                 <pic:pic>
                   <pic:nvPicPr>
-                    <pic:cNvPr id="0" name="image3.png"/>
+                    <pic:cNvPr id="0" name="image8.png"/>
                     <pic:cNvPicPr preferRelativeResize="0"/>
                   </pic:nvPicPr>
                   <pic:blipFill>
@@ -369,12 +369,12 @@
           <wp:inline distB="0" distT="0" distL="0" distR="0">
             <wp:extent cx="3349421" cy="2247241"/>
             <wp:effectExtent b="0" l="0" r="0" t="0"/>
-            <wp:docPr id="15" name="image4.png"/>
+            <wp:docPr id="15" name="image5.png"/>
             <a:graphic>
               <a:graphicData uri="http://schemas.openxmlformats.org/drawingml/2006/picture">
                 <pic:pic>
                   <pic:nvPicPr>
-                    <pic:cNvPr id="0" name="image4.png"/>
+                    <pic:cNvPr id="0" name="image5.png"/>
                     <pic:cNvPicPr preferRelativeResize="0"/>
                   </pic:nvPicPr>
                   <pic:blipFill>
@@ -416,12 +416,12 @@
             <wp:extent cx="2114550" cy="2009775"/>
             <wp:effectExtent b="0" l="0" r="0" t="0"/>
             <wp:wrapNone/>
-            <wp:docPr id="2" name="image10.png"/>
+            <wp:docPr id="2" name="image3.png"/>
             <a:graphic>
               <a:graphicData uri="http://schemas.openxmlformats.org/drawingml/2006/picture">
                 <pic:pic>
                   <pic:nvPicPr>
-                    <pic:cNvPr id="0" name="image10.png"/>
+                    <pic:cNvPr id="0" name="image3.png"/>
                     <pic:cNvPicPr preferRelativeResize="0"/>
                   </pic:nvPicPr>
                   <pic:blipFill>
@@ -666,12 +666,12 @@
           <wp:inline distB="0" distT="0" distL="0" distR="0">
             <wp:extent cx="3139903" cy="2121370"/>
             <wp:effectExtent b="0" l="0" r="0" t="0"/>
-            <wp:docPr id="14" name="image2.png"/>
+            <wp:docPr id="14" name="image1.png"/>
             <a:graphic>
               <a:graphicData uri="http://schemas.openxmlformats.org/drawingml/2006/picture">
                 <pic:pic>
                   <pic:nvPicPr>
-                    <pic:cNvPr id="0" name="image2.png"/>
+                    <pic:cNvPr id="0" name="image1.png"/>
                     <pic:cNvPicPr preferRelativeResize="0"/>
                   </pic:nvPicPr>
                   <pic:blipFill>
@@ -789,12 +789,12 @@
           <wp:inline distB="0" distT="0" distL="0" distR="0">
             <wp:extent cx="2952000" cy="1957752"/>
             <wp:effectExtent b="0" l="0" r="0" t="0"/>
-            <wp:docPr id="17" name="image22.png"/>
+            <wp:docPr id="17" name="image13.png"/>
             <a:graphic>
               <a:graphicData uri="http://schemas.openxmlformats.org/drawingml/2006/picture">
                 <pic:pic>
                   <pic:nvPicPr>
-                    <pic:cNvPr id="0" name="image22.png"/>
+                    <pic:cNvPr id="0" name="image13.png"/>
                     <pic:cNvPicPr preferRelativeResize="0"/>
                   </pic:nvPicPr>
                   <pic:blipFill>
@@ -831,12 +831,12 @@
           <wp:inline distB="0" distT="0" distL="0" distR="0">
             <wp:extent cx="2952000" cy="2001190"/>
             <wp:effectExtent b="0" l="0" r="0" t="0"/>
-            <wp:docPr id="16" name="image6.png"/>
+            <wp:docPr id="16" name="image4.png"/>
             <a:graphic>
               <a:graphicData uri="http://schemas.openxmlformats.org/drawingml/2006/picture">
                 <pic:pic>
                   <pic:nvPicPr>
-                    <pic:cNvPr id="0" name="image6.png"/>
+                    <pic:cNvPr id="0" name="image4.png"/>
                     <pic:cNvPicPr preferRelativeResize="0"/>
                   </pic:nvPicPr>
                   <pic:blipFill>
@@ -985,12 +985,12 @@
           <wp:inline distB="0" distT="0" distL="0" distR="0">
             <wp:extent cx="2952000" cy="1978342"/>
             <wp:effectExtent b="0" l="0" r="0" t="0"/>
-            <wp:docPr id="19" name="image9.png"/>
+            <wp:docPr id="19" name="image10.png"/>
             <a:graphic>
               <a:graphicData uri="http://schemas.openxmlformats.org/drawingml/2006/picture">
                 <pic:pic>
                   <pic:nvPicPr>
-                    <pic:cNvPr id="0" name="image9.png"/>
+                    <pic:cNvPr id="0" name="image10.png"/>
                     <pic:cNvPicPr preferRelativeResize="0"/>
                   </pic:nvPicPr>
                   <pic:blipFill>
@@ -1054,12 +1054,12 @@
           <wp:inline distB="0" distT="0" distL="0" distR="0">
             <wp:extent cx="2952000" cy="2077626"/>
             <wp:effectExtent b="0" l="0" r="0" t="0"/>
-            <wp:docPr id="18" name="image14.png"/>
+            <wp:docPr id="18" name="image11.png"/>
             <a:graphic>
               <a:graphicData uri="http://schemas.openxmlformats.org/drawingml/2006/picture">
                 <pic:pic>
                   <pic:nvPicPr>
-                    <pic:cNvPr id="0" name="image14.png"/>
+                    <pic:cNvPr id="0" name="image11.png"/>
                     <pic:cNvPicPr preferRelativeResize="0"/>
                   </pic:nvPicPr>
                   <pic:blipFill>
@@ -1254,12 +1254,12 @@
           <wp:inline distB="0" distT="0" distL="0" distR="0">
             <wp:extent cx="2952000" cy="2003163"/>
             <wp:effectExtent b="0" l="0" r="0" t="0"/>
-            <wp:docPr id="20" name="image16.png"/>
+            <wp:docPr id="20" name="image7.png"/>
             <a:graphic>
               <a:graphicData uri="http://schemas.openxmlformats.org/drawingml/2006/picture">
                 <pic:pic>
                   <pic:nvPicPr>
-                    <pic:cNvPr id="0" name="image16.png"/>
+                    <pic:cNvPr id="0" name="image7.png"/>
                     <pic:cNvPicPr preferRelativeResize="0"/>
                   </pic:nvPicPr>
                   <pic:blipFill>
@@ -1343,12 +1343,12 @@
           <wp:inline distB="0" distT="0" distL="0" distR="0">
             <wp:extent cx="6645910" cy="4175125"/>
             <wp:effectExtent b="0" l="0" r="0" t="0"/>
-            <wp:docPr id="22" name="image17.png"/>
+            <wp:docPr id="22" name="image19.png"/>
             <a:graphic>
               <a:graphicData uri="http://schemas.openxmlformats.org/drawingml/2006/picture">
                 <pic:pic>
                   <pic:nvPicPr>
-                    <pic:cNvPr id="0" name="image17.png"/>
+                    <pic:cNvPr id="0" name="image19.png"/>
                     <pic:cNvPicPr preferRelativeResize="0"/>
                   </pic:nvPicPr>
                   <pic:blipFill>
@@ -1391,12 +1391,12 @@
             <wp:extent cx="1026942" cy="782176"/>
             <wp:effectExtent b="0" l="0" r="0" t="0"/>
             <wp:wrapNone/>
-            <wp:docPr descr="Imagen que contiene cielo, estrella, agua, colina&#10;&#10;El contenido generado por IA puede ser incorrecto." id="3" name="image8.jpg"/>
+            <wp:docPr descr="Imagen que contiene cielo, estrella, agua, colina&#10;&#10;El contenido generado por IA puede ser incorrecto." id="3" name="image9.jpg"/>
             <a:graphic>
               <a:graphicData uri="http://schemas.openxmlformats.org/drawingml/2006/picture">
                 <pic:pic>
                   <pic:nvPicPr>
-                    <pic:cNvPr descr="Imagen que contiene cielo, estrella, agua, colina&#10;&#10;El contenido generado por IA puede ser incorrecto." id="0" name="image8.jpg"/>
+                    <pic:cNvPr descr="Imagen que contiene cielo, estrella, agua, colina&#10;&#10;El contenido generado por IA puede ser incorrecto." id="0" name="image9.jpg"/>
                     <pic:cNvPicPr preferRelativeResize="0"/>
                   </pic:nvPicPr>
                   <pic:blipFill>
@@ -1617,12 +1617,12 @@
           <wp:inline distB="0" distT="0" distL="0" distR="0">
             <wp:extent cx="2952000" cy="1991035"/>
             <wp:effectExtent b="0" l="0" r="0" t="0"/>
-            <wp:docPr id="23" name="image20.png"/>
+            <wp:docPr id="23" name="image23.png"/>
             <a:graphic>
               <a:graphicData uri="http://schemas.openxmlformats.org/drawingml/2006/picture">
                 <pic:pic>
                   <pic:nvPicPr>
-                    <pic:cNvPr id="0" name="image20.png"/>
+                    <pic:cNvPr id="0" name="image23.png"/>
                     <pic:cNvPicPr preferRelativeResize="0"/>
                   </pic:nvPicPr>
                   <pic:blipFill>
@@ -1659,12 +1659,12 @@
           <wp:inline distB="0" distT="0" distL="0" distR="0">
             <wp:extent cx="2952000" cy="1983983"/>
             <wp:effectExtent b="0" l="0" r="0" t="0"/>
-            <wp:docPr id="24" name="image21.png"/>
+            <wp:docPr id="24" name="image26.png"/>
             <a:graphic>
               <a:graphicData uri="http://schemas.openxmlformats.org/drawingml/2006/picture">
                 <pic:pic>
                   <pic:nvPicPr>
-                    <pic:cNvPr id="0" name="image21.png"/>
+                    <pic:cNvPr id="0" name="image26.png"/>
                     <pic:cNvPicPr preferRelativeResize="0"/>
                   </pic:nvPicPr>
                   <pic:blipFill>
@@ -1748,12 +1748,12 @@
           <wp:inline distB="0" distT="0" distL="0" distR="0">
             <wp:extent cx="2952000" cy="1989624"/>
             <wp:effectExtent b="0" l="0" r="0" t="0"/>
-            <wp:docPr id="25" name="image25.png"/>
+            <wp:docPr id="25" name="image21.png"/>
             <a:graphic>
               <a:graphicData uri="http://schemas.openxmlformats.org/drawingml/2006/picture">
                 <pic:pic>
                   <pic:nvPicPr>
-                    <pic:cNvPr id="0" name="image25.png"/>
+                    <pic:cNvPr id="0" name="image21.png"/>
                     <pic:cNvPicPr preferRelativeResize="0"/>
                   </pic:nvPicPr>
                   <pic:blipFill>
@@ -1789,12 +1789,12 @@
           <wp:inline distB="0" distT="0" distL="0" distR="0">
             <wp:extent cx="2952000" cy="2000907"/>
             <wp:effectExtent b="0" l="0" r="0" t="0"/>
-            <wp:docPr id="26" name="image23.png"/>
+            <wp:docPr id="26" name="image25.png"/>
             <a:graphic>
               <a:graphicData uri="http://schemas.openxmlformats.org/drawingml/2006/picture">
                 <pic:pic>
                   <pic:nvPicPr>
-                    <pic:cNvPr id="0" name="image23.png"/>
+                    <pic:cNvPr id="0" name="image25.png"/>
                     <pic:cNvPicPr preferRelativeResize="0"/>
                   </pic:nvPicPr>
                   <pic:blipFill>
@@ -1835,12 +1835,12 @@
           <wp:inline distB="0" distT="0" distL="0" distR="0">
             <wp:extent cx="2952000" cy="1997240"/>
             <wp:effectExtent b="0" l="0" r="0" t="0"/>
-            <wp:docPr id="27" name="image24.png"/>
+            <wp:docPr id="27" name="image22.png"/>
             <a:graphic>
               <a:graphicData uri="http://schemas.openxmlformats.org/drawingml/2006/picture">
                 <pic:pic>
                   <pic:nvPicPr>
-                    <pic:cNvPr id="0" name="image24.png"/>
+                    <pic:cNvPr id="0" name="image22.png"/>
                     <pic:cNvPicPr preferRelativeResize="0"/>
                   </pic:nvPicPr>
                   <pic:blipFill>
@@ -1876,12 +1876,12 @@
           <wp:inline distB="0" distT="0" distL="0" distR="0">
             <wp:extent cx="2952000" cy="1991035"/>
             <wp:effectExtent b="0" l="0" r="0" t="0"/>
-            <wp:docPr id="28" name="image20.png"/>
+            <wp:docPr id="28" name="image23.png"/>
             <a:graphic>
               <a:graphicData uri="http://schemas.openxmlformats.org/drawingml/2006/picture">
                 <pic:pic>
                   <pic:nvPicPr>
-                    <pic:cNvPr id="0" name="image20.png"/>
+                    <pic:cNvPr id="0" name="image23.png"/>
                     <pic:cNvPicPr preferRelativeResize="0"/>
                   </pic:nvPicPr>
                   <pic:blipFill>
@@ -2062,12 +2062,12 @@
           <wp:inline distB="0" distT="0" distL="0" distR="0">
             <wp:extent cx="2952000" cy="2012471"/>
             <wp:effectExtent b="0" l="0" r="0" t="0"/>
-            <wp:docPr id="29" name="image26.png"/>
+            <wp:docPr id="29" name="image27.png"/>
             <a:graphic>
               <a:graphicData uri="http://schemas.openxmlformats.org/drawingml/2006/picture">
                 <pic:pic>
                   <pic:nvPicPr>
-                    <pic:cNvPr id="0" name="image26.png"/>
+                    <pic:cNvPr id="0" name="image27.png"/>
                     <pic:cNvPicPr preferRelativeResize="0"/>
                   </pic:nvPicPr>
                   <pic:blipFill>
@@ -2103,12 +2103,12 @@
           <wp:inline distB="0" distT="0" distL="0" distR="0">
             <wp:extent cx="2952000" cy="1956624"/>
             <wp:effectExtent b="0" l="0" r="0" t="0"/>
-            <wp:docPr id="4" name="image7.png"/>
+            <wp:docPr id="4" name="image15.png"/>
             <a:graphic>
               <a:graphicData uri="http://schemas.openxmlformats.org/drawingml/2006/picture">
                 <pic:pic>
                   <pic:nvPicPr>
-                    <pic:cNvPr id="0" name="image7.png"/>
+                    <pic:cNvPr id="0" name="image15.png"/>
                     <pic:cNvPicPr preferRelativeResize="0"/>
                   </pic:nvPicPr>
                   <pic:blipFill>
@@ -2152,12 +2152,12 @@
           <wp:inline distB="0" distT="0" distL="0" distR="0">
             <wp:extent cx="2952000" cy="2002035"/>
             <wp:effectExtent b="0" l="0" r="0" t="0"/>
-            <wp:docPr id="5" name="image27.png"/>
+            <wp:docPr id="5" name="image17.png"/>
             <a:graphic>
               <a:graphicData uri="http://schemas.openxmlformats.org/drawingml/2006/picture">
                 <pic:pic>
                   <pic:nvPicPr>
-                    <pic:cNvPr id="0" name="image27.png"/>
+                    <pic:cNvPr id="0" name="image17.png"/>
                     <pic:cNvPicPr preferRelativeResize="0"/>
                   </pic:nvPicPr>
                   <pic:blipFill>
@@ -2193,12 +2193,12 @@
           <wp:inline distB="0" distT="0" distL="0" distR="0">
             <wp:extent cx="2952000" cy="1981445"/>
             <wp:effectExtent b="0" l="0" r="0" t="0"/>
-            <wp:docPr id="6" name="image5.png"/>
+            <wp:docPr id="6" name="image24.png"/>
             <a:graphic>
               <a:graphicData uri="http://schemas.openxmlformats.org/drawingml/2006/picture">
                 <pic:pic>
                   <pic:nvPicPr>
-                    <pic:cNvPr id="0" name="image5.png"/>
+                    <pic:cNvPr id="0" name="image24.png"/>
                     <pic:cNvPicPr preferRelativeResize="0"/>
                   </pic:nvPicPr>
                   <pic:blipFill>
@@ -2254,12 +2254,12 @@
           <wp:inline distB="0" distT="0" distL="0" distR="0">
             <wp:extent cx="2952000" cy="2019522"/>
             <wp:effectExtent b="0" l="0" r="0" t="0"/>
-            <wp:docPr id="7" name="image15.png"/>
+            <wp:docPr id="7" name="image20.png"/>
             <a:graphic>
               <a:graphicData uri="http://schemas.openxmlformats.org/drawingml/2006/picture">
                 <pic:pic>
                   <pic:nvPicPr>
-                    <pic:cNvPr id="0" name="image15.png"/>
+                    <pic:cNvPr id="0" name="image20.png"/>
                     <pic:cNvPicPr preferRelativeResize="0"/>
                   </pic:nvPicPr>
                   <pic:blipFill>
@@ -2295,12 +2295,12 @@
           <wp:inline distB="0" distT="0" distL="0" distR="0">
             <wp:extent cx="2952000" cy="1987368"/>
             <wp:effectExtent b="0" l="0" r="0" t="0"/>
-            <wp:docPr id="8" name="image12.png"/>
+            <wp:docPr id="8" name="image14.png"/>
             <a:graphic>
               <a:graphicData uri="http://schemas.openxmlformats.org/drawingml/2006/picture">
                 <pic:pic>
                   <pic:nvPicPr>
-                    <pic:cNvPr id="0" name="image12.png"/>
+                    <pic:cNvPr id="0" name="image14.png"/>
                     <pic:cNvPicPr preferRelativeResize="0"/>
                   </pic:nvPicPr>
                   <pic:blipFill>
@@ -2367,12 +2367,12 @@
           <wp:inline distB="0" distT="0" distL="0" distR="0">
             <wp:extent cx="2952000" cy="1986240"/>
             <wp:effectExtent b="0" l="0" r="0" t="0"/>
-            <wp:docPr id="9" name="image19.png"/>
+            <wp:docPr id="9" name="image2.png"/>
             <a:graphic>
               <a:graphicData uri="http://schemas.openxmlformats.org/drawingml/2006/picture">
                 <pic:pic>
                   <pic:nvPicPr>
-                    <pic:cNvPr id="0" name="image19.png"/>
+                    <pic:cNvPr id="0" name="image2.png"/>
                     <pic:cNvPicPr preferRelativeResize="0"/>
                   </pic:nvPicPr>
                   <pic:blipFill>
@@ -2409,12 +2409,12 @@
           <wp:inline distB="0" distT="0" distL="0" distR="0">
             <wp:extent cx="2952000" cy="1993009"/>
             <wp:effectExtent b="0" l="0" r="0" t="0"/>
-            <wp:docPr id="10" name="image11.png"/>
+            <wp:docPr id="10" name="image16.png"/>
             <a:graphic>
               <a:graphicData uri="http://schemas.openxmlformats.org/drawingml/2006/picture">
                 <pic:pic>
                   <pic:nvPicPr>
-                    <pic:cNvPr id="0" name="image11.png"/>
+                    <pic:cNvPr id="0" name="image16.png"/>
                     <pic:cNvPicPr preferRelativeResize="0"/>
                   </pic:nvPicPr>
                   <pic:blipFill>
@@ -3188,12 +3188,12 @@
           <wp:inline distB="0" distT="0" distL="0" distR="0">
             <wp:extent cx="4824413" cy="5047507"/>
             <wp:effectExtent b="0" l="0" r="0" t="0"/>
-            <wp:docPr id="11" name="image13.png"/>
+            <wp:docPr id="11" name="image6.png"/>
             <a:graphic>
               <a:graphicData uri="http://schemas.openxmlformats.org/drawingml/2006/picture">
                 <pic:pic>
                   <pic:nvPicPr>
-                    <pic:cNvPr id="0" name="image13.png"/>
+                    <pic:cNvPr id="0" name="image6.png"/>
                     <pic:cNvPicPr preferRelativeResize="0"/>
                   </pic:nvPicPr>
                   <pic:blipFill>
@@ -3392,6 +3392,25 @@
           <w:rtl w:val="0"/>
         </w:rPr>
         <w:t xml:space="preserve">heatmap.py . To run it just execute “python3 heatmap.py” from the same directory as where the .dat files are generated. This script reads the temp_diag.dat file to access the temperature values, and the state.dat value to retrieve the standard DX value. Several parameters can be changed to the users liking, like the .lut file to be used. In the first lines of code there is a variable named LUT_FILENAME, which represents the .lut file. Font sizes can be altered in the plt.rcParams.update function call (line 8). “Xtick” and “ytick” represent the values on the axis.</w:t>
+      </w:r>
+    </w:p>
+    <w:p>
+      <w:pPr>
+        <w:numPr>
+          <w:ilvl w:val="0"/>
+          <w:numId w:val="7"/>
+        </w:numPr>
+        <w:spacing w:after="0" w:line="240" w:lineRule="auto"/>
+        <w:ind w:left="1440" w:hanging="360"/>
+        <w:rPr>
+          <w:u w:val="none"/>
+        </w:rPr>
+      </w:pPr>
+      <w:r>
+        <w:rPr>
+          <w:rtl w:val="0"/>
+        </w:rPr>
+        <w:t xml:space="preserve">The thresholds for min and max for the LUT can be set manually. The default value is the maximum and minimum value of the data, but this can be modified. To manually set the maximum threshold, change MANUAL_LUT_TEMP_MAX to True, and set the value you want as a threshold in LUT_MAX. Same thing goes for the minimum value, set MANUAL_LUT_TEMP_MIN to true and input the value in LUT_MIN. All these variables are at the top of the code.</w:t>
       </w:r>
       <w:r>
         <w:rPr>

</xml_diff>

<commit_message>
Update todo with new issue
</commit_message>
<xml_diff>
--- a/status-quo-laser8-fs-Si_v2.docx
+++ b/status-quo-laser8-fs-Si_v2.docx
@@ -38,7 +38,6 @@
           <w:ilvl w:val="0"/>
           <w:numId w:val="2"/>
         </w:numPr>
-        <w:pBdr/>
         <w:shd w:val="clear" w:fill="auto"/>
         <w:spacing w:lineRule="auto" w:line="259" w:before="0" w:after="0"/>
         <w:ind w:hanging="360" w:start="360" w:end="0"/>
@@ -78,7 +77,6 @@
           <w:ilvl w:val="0"/>
           <w:numId w:val="4"/>
         </w:numPr>
-        <w:pBdr/>
         <w:shd w:val="clear" w:fill="auto"/>
         <w:spacing w:lineRule="auto" w:line="259" w:before="0" w:after="0"/>
         <w:ind w:hanging="360" w:start="360" w:end="0"/>
@@ -118,7 +116,6 @@
           <w:ilvl w:val="0"/>
           <w:numId w:val="4"/>
         </w:numPr>
-        <w:pBdr/>
         <w:shd w:val="clear" w:fill="auto"/>
         <w:spacing w:lineRule="auto" w:line="259" w:before="0" w:after="0"/>
         <w:ind w:hanging="360" w:start="360" w:end="0"/>
@@ -175,7 +172,6 @@
         <w:keepLines w:val="false"/>
         <w:pageBreakBefore w:val="false"/>
         <w:widowControl/>
-        <w:pBdr/>
         <w:shd w:val="clear" w:fill="auto"/>
         <w:spacing w:lineRule="auto" w:line="259" w:before="0" w:after="0"/>
         <w:ind w:hanging="0" w:start="0" w:end="0"/>
@@ -240,7 +236,7 @@
           </wp:inline>
         </w:drawing>
         <w:drawing>
-          <wp:anchor distT="0" distB="0" distL="0" distR="0" simplePos="0" relativeHeight="4" behindDoc="0" locked="0" layoutInCell="1" allowOverlap="1">
+          <wp:anchor distT="0" distB="0" distL="0" distR="0" simplePos="0" relativeHeight="27" behindDoc="0" locked="0" layoutInCell="1" allowOverlap="1">
             <wp:simplePos x="0" y="0"/>
             <wp:positionH relativeFrom="column">
               <wp:posOffset>3790950</wp:posOffset>
@@ -298,7 +294,6 @@
           <w:ilvl w:val="0"/>
           <w:numId w:val="5"/>
         </w:numPr>
-        <w:pBdr/>
         <w:shd w:val="clear" w:fill="auto"/>
         <w:spacing w:lineRule="auto" w:line="259" w:before="0" w:after="160"/>
         <w:ind w:hanging="360" w:start="360" w:end="0"/>
@@ -373,7 +368,7 @@
           </wp:inline>
         </w:drawing>
         <w:drawing>
-          <wp:anchor distT="0" distB="0" distL="0" distR="0" simplePos="0" relativeHeight="13" behindDoc="0" locked="0" layoutInCell="1" allowOverlap="1">
+          <wp:anchor distT="0" distB="0" distL="0" distR="0" simplePos="0" relativeHeight="28" behindDoc="0" locked="0" layoutInCell="1" allowOverlap="1">
             <wp:simplePos x="0" y="0"/>
             <wp:positionH relativeFrom="column">
               <wp:posOffset>4029075</wp:posOffset>
@@ -399,7 +394,7 @@
                   </pic:nvPicPr>
                   <pic:blipFill>
                     <a:blip r:embed="rId5"/>
-                    <a:srcRect l="55768" t="18998" r="1598" b="0"/>
+                    <a:srcRect l="55764" t="18998" r="1598" b="0"/>
                     <a:stretch>
                       <a:fillRect/>
                     </a:stretch>
@@ -432,7 +427,6 @@
           <w:ilvl w:val="0"/>
           <w:numId w:val="3"/>
         </w:numPr>
-        <w:pBdr/>
         <w:shd w:val="clear" w:fill="auto"/>
         <w:spacing w:lineRule="auto" w:line="259" w:before="0" w:after="160"/>
         <w:ind w:hanging="360" w:start="360" w:end="0"/>
@@ -529,7 +523,6 @@
           <w:ilvl w:val="0"/>
           <w:numId w:val="6"/>
         </w:numPr>
-        <w:pBdr/>
         <w:shd w:val="clear" w:fill="auto"/>
         <w:spacing w:lineRule="auto" w:line="259" w:before="0" w:after="0"/>
         <w:ind w:hanging="360" w:start="720" w:end="0"/>
@@ -585,7 +578,6 @@
           <w:ilvl w:val="0"/>
           <w:numId w:val="6"/>
         </w:numPr>
-        <w:pBdr/>
         <w:shd w:val="clear" w:fill="auto"/>
         <w:spacing w:lineRule="auto" w:line="259" w:before="0" w:after="160"/>
         <w:ind w:hanging="360" w:start="720" w:end="0"/>
@@ -721,7 +713,6 @@
           <w:ilvl w:val="0"/>
           <w:numId w:val="4"/>
         </w:numPr>
-        <w:pBdr/>
         <w:shd w:val="clear" w:fill="auto"/>
         <w:spacing w:lineRule="auto" w:line="259" w:before="0" w:after="160"/>
         <w:ind w:hanging="360" w:start="360" w:end="0"/>
@@ -874,7 +865,6 @@
           <w:ilvl w:val="0"/>
           <w:numId w:val="4"/>
         </w:numPr>
-        <w:pBdr/>
         <w:shd w:val="clear" w:fill="auto"/>
         <w:spacing w:lineRule="auto" w:line="259" w:before="0" w:after="0"/>
         <w:ind w:hanging="360" w:start="360" w:end="0"/>
@@ -914,7 +904,6 @@
           <w:ilvl w:val="0"/>
           <w:numId w:val="4"/>
         </w:numPr>
-        <w:pBdr/>
         <w:shd w:val="clear" w:fill="auto"/>
         <w:spacing w:lineRule="auto" w:line="259" w:before="0" w:after="0"/>
         <w:ind w:hanging="360" w:start="360" w:end="0"/>
@@ -1059,7 +1048,6 @@
           <w:ilvl w:val="0"/>
           <w:numId w:val="4"/>
         </w:numPr>
-        <w:pBdr/>
         <w:shd w:val="clear" w:fill="auto"/>
         <w:spacing w:lineRule="auto" w:line="259" w:before="0" w:after="0"/>
         <w:ind w:hanging="360" w:start="360" w:end="0"/>
@@ -1095,7 +1083,6 @@
         <w:keepLines w:val="false"/>
         <w:pageBreakBefore w:val="false"/>
         <w:widowControl/>
-        <w:pBdr/>
         <w:shd w:val="clear" w:fill="auto"/>
         <w:spacing w:lineRule="auto" w:line="259" w:before="0" w:after="0"/>
         <w:ind w:hanging="0" w:start="360" w:end="0"/>
@@ -1235,7 +1222,6 @@
           <w:ilvl w:val="0"/>
           <w:numId w:val="4"/>
         </w:numPr>
-        <w:pBdr/>
         <w:shd w:val="clear" w:fill="auto"/>
         <w:spacing w:lineRule="auto" w:line="240" w:before="0" w:after="0"/>
         <w:ind w:hanging="360" w:start="360" w:end="0"/>
@@ -1312,9 +1298,8 @@
         </w:drawing>
       </w:r>
       <w:r>
-        <w:rPr/>
         <w:drawing>
-          <wp:anchor distT="0" distB="0" distL="0" distR="0" simplePos="0" relativeHeight="14" behindDoc="0" locked="0" layoutInCell="1" allowOverlap="1">
+          <wp:anchor distT="0" distB="0" distL="0" distR="0" simplePos="0" relativeHeight="29" behindDoc="0" locked="0" layoutInCell="1" allowOverlap="1">
             <wp:simplePos x="0" y="0"/>
             <wp:positionH relativeFrom="column">
               <wp:posOffset>1577975</wp:posOffset>
@@ -1362,7 +1347,7 @@
         <mc:AlternateContent>
           <mc:Choice Requires="wps">
             <w:drawing>
-              <wp:anchor distT="0" distB="0" distL="0" distR="0" simplePos="0" relativeHeight="30" behindDoc="0" locked="0" layoutInCell="1" allowOverlap="1">
+              <wp:anchor distT="5080" distB="5080" distL="5080" distR="5080" simplePos="0" relativeHeight="30" behindDoc="0" locked="0" layoutInCell="1" allowOverlap="1">
                 <wp:simplePos x="0" y="0"/>
                 <wp:positionH relativeFrom="column">
                   <wp:posOffset>1814830</wp:posOffset>
@@ -1406,7 +1391,7 @@
                         <w:txbxContent>
                           <w:p>
                             <w:pPr>
-                              <w:pStyle w:val="FrameContents"/>
+                              <w:pStyle w:val="FrameContentsuser"/>
                               <w:spacing w:lineRule="auto" w:line="259" w:before="0" w:after="160"/>
                               <w:ind w:hanging="0" w:start="0" w:end="0"/>
                               <w:jc w:val="start"/>
@@ -1449,7 +1434,7 @@
                   <w:txbxContent>
                     <w:p>
                       <w:pPr>
-                        <w:pStyle w:val="FrameContents"/>
+                        <w:pStyle w:val="FrameContentsuser"/>
                         <w:spacing w:lineRule="auto" w:line="259" w:before="0" w:after="160"/>
                         <w:ind w:hanging="0" w:start="0" w:end="0"/>
                         <w:jc w:val="start"/>
@@ -1516,7 +1501,6 @@
           <w:ilvl w:val="0"/>
           <w:numId w:val="4"/>
         </w:numPr>
-        <w:pBdr/>
         <w:shd w:val="clear" w:fill="auto"/>
         <w:spacing w:lineRule="auto" w:line="240" w:before="0" w:after="0"/>
         <w:ind w:hanging="360" w:start="360" w:end="0"/>
@@ -1653,7 +1637,6 @@
           <w:ilvl w:val="0"/>
           <w:numId w:val="4"/>
         </w:numPr>
-        <w:pBdr/>
         <w:shd w:val="clear" w:fill="auto"/>
         <w:spacing w:lineRule="auto" w:line="240" w:before="0" w:after="0"/>
         <w:ind w:hanging="360" w:start="360" w:end="0"/>
@@ -1875,7 +1858,6 @@
         <w:keepLines w:val="false"/>
         <w:pageBreakBefore w:val="false"/>
         <w:widowControl/>
-        <w:pBdr/>
         <w:shd w:val="clear" w:fill="auto"/>
         <w:spacing w:lineRule="auto" w:line="240" w:before="0" w:after="0"/>
         <w:ind w:hanging="0" w:start="360" w:end="0"/>
@@ -1931,7 +1913,6 @@
           <w:ilvl w:val="0"/>
           <w:numId w:val="4"/>
         </w:numPr>
-        <w:pBdr/>
         <w:shd w:val="clear" w:fill="auto"/>
         <w:spacing w:lineRule="auto" w:line="240" w:before="0" w:after="0"/>
         <w:ind w:hanging="360" w:start="360" w:end="0"/>
@@ -1971,7 +1952,6 @@
           <w:ilvl w:val="0"/>
           <w:numId w:val="4"/>
         </w:numPr>
-        <w:pBdr/>
         <w:shd w:val="clear" w:fill="auto"/>
         <w:spacing w:lineRule="auto" w:line="240" w:before="0" w:after="0"/>
         <w:ind w:hanging="360" w:start="360" w:end="0"/>
@@ -2790,7 +2770,6 @@
           <w:ilvl w:val="0"/>
           <w:numId w:val="4"/>
         </w:numPr>
-        <w:pBdr/>
         <w:shd w:val="clear" w:fill="auto"/>
         <w:spacing w:lineRule="auto" w:line="240" w:before="0" w:after="0"/>
         <w:ind w:hanging="360" w:start="360" w:end="0"/>
@@ -2852,7 +2831,6 @@
           <w:ilvl w:val="1"/>
           <w:numId w:val="4"/>
         </w:numPr>
-        <w:pBdr/>
         <w:shd w:val="clear" w:fill="auto"/>
         <w:spacing w:lineRule="auto" w:line="240" w:before="0" w:after="0"/>
         <w:ind w:hanging="360" w:start="1080" w:end="0"/>
@@ -2905,7 +2883,6 @@
         <w:keepLines w:val="false"/>
         <w:pageBreakBefore w:val="false"/>
         <w:widowControl/>
-        <w:pBdr/>
         <w:shd w:val="clear" w:fill="auto"/>
         <w:spacing w:lineRule="auto" w:line="240" w:before="0" w:after="0"/>
         <w:ind w:hanging="0" w:start="1080" w:end="0"/>
@@ -2927,7 +2904,6 @@
         <w:keepLines w:val="false"/>
         <w:pageBreakBefore w:val="false"/>
         <w:widowControl/>
-        <w:pBdr/>
         <w:shd w:val="clear" w:fill="auto"/>
         <w:spacing w:lineRule="auto" w:line="240" w:before="0" w:after="0"/>
         <w:ind w:hanging="0" w:start="1080" w:end="0"/>
@@ -2946,7 +2922,6 @@
         <w:keepLines w:val="false"/>
         <w:pageBreakBefore w:val="false"/>
         <w:widowControl/>
-        <w:pBdr/>
         <w:shd w:val="clear" w:fill="auto"/>
         <w:spacing w:lineRule="auto" w:line="240" w:before="0" w:after="0"/>
         <w:ind w:hanging="0" w:start="1080" w:end="0"/>
@@ -2968,7 +2943,6 @@
           <w:ilvl w:val="1"/>
           <w:numId w:val="4"/>
         </w:numPr>
-        <w:pBdr/>
         <w:shd w:val="clear" w:fill="auto"/>
         <w:spacing w:lineRule="auto" w:line="240" w:before="0" w:after="0"/>
         <w:ind w:hanging="360" w:start="1080" w:end="0"/>
@@ -3021,7 +2995,6 @@
         <w:keepLines w:val="false"/>
         <w:pageBreakBefore w:val="false"/>
         <w:widowControl/>
-        <w:pBdr/>
         <w:shd w:val="clear" w:fill="auto"/>
         <w:spacing w:lineRule="auto" w:line="240" w:before="0" w:after="0"/>
         <w:ind w:hanging="0" w:start="1080" w:end="0"/>
@@ -3037,7 +3010,6 @@
       <w:pPr>
         <w:pStyle w:val="normal1"/>
         <w:widowControl/>
-        <w:pBdr/>
         <w:shd w:val="clear" w:fill="auto"/>
         <w:spacing w:lineRule="auto" w:line="240" w:before="0" w:after="0"/>
         <w:ind w:hanging="0" w:start="1080" w:end="0"/>
@@ -3053,7 +3025,6 @@
       <w:pPr>
         <w:pStyle w:val="normal1"/>
         <w:widowControl/>
-        <w:pBdr/>
         <w:shd w:val="clear" w:fill="auto"/>
         <w:spacing w:lineRule="auto" w:line="240" w:before="0" w:after="0"/>
         <w:ind w:hanging="0" w:start="1080" w:end="0"/>
@@ -3079,7 +3050,6 @@
       <w:pPr>
         <w:pStyle w:val="normal1"/>
         <w:widowControl/>
-        <w:pBdr/>
         <w:shd w:val="clear" w:fill="auto"/>
         <w:spacing w:lineRule="auto" w:line="240" w:before="0" w:after="0"/>
         <w:ind w:hanging="0" w:start="1080" w:end="0"/>
@@ -3095,7 +3065,6 @@
       <w:pPr>
         <w:pStyle w:val="normal1"/>
         <w:widowControl/>
-        <w:pBdr/>
         <w:shd w:val="clear" w:fill="auto"/>
         <w:spacing w:lineRule="auto" w:line="240" w:before="0" w:after="0"/>
         <w:ind w:hanging="0" w:start="1080" w:end="0"/>
@@ -3111,7 +3080,6 @@
       <w:pPr>
         <w:pStyle w:val="normal1"/>
         <w:widowControl/>
-        <w:pBdr/>
         <w:shd w:val="clear" w:fill="auto"/>
         <w:spacing w:lineRule="auto" w:line="240" w:before="0" w:after="0"/>
         <w:ind w:hanging="0" w:start="1080" w:end="0"/>
@@ -3127,7 +3095,6 @@
       <w:pPr>
         <w:pStyle w:val="normal1"/>
         <w:widowControl/>
-        <w:pBdr/>
         <w:shd w:val="clear" w:fill="auto"/>
         <w:spacing w:lineRule="auto" w:line="240" w:before="0" w:after="0"/>
         <w:ind w:hanging="0" w:start="1080" w:end="0"/>
@@ -3142,7 +3109,6 @@
       <w:pPr>
         <w:pStyle w:val="normal1"/>
         <w:widowControl/>
-        <w:pBdr/>
         <w:shd w:val="clear" w:fill="auto"/>
         <w:spacing w:lineRule="auto" w:line="240" w:before="0" w:after="0"/>
         <w:ind w:hanging="0" w:start="1080" w:end="0"/>
@@ -3158,7 +3124,6 @@
       <w:pPr>
         <w:pStyle w:val="normal1"/>
         <w:widowControl/>
-        <w:pBdr/>
         <w:shd w:val="clear" w:fill="auto"/>
         <w:spacing w:lineRule="auto" w:line="240" w:before="0" w:after="0"/>
         <w:ind w:hanging="0" w:start="1080" w:end="0"/>
@@ -3174,7 +3139,6 @@
       <w:pPr>
         <w:pStyle w:val="normal1"/>
         <w:widowControl/>
-        <w:pBdr/>
         <w:shd w:val="clear" w:fill="auto"/>
         <w:spacing w:lineRule="auto" w:line="240" w:before="0" w:after="0"/>
         <w:ind w:hanging="0" w:start="1080" w:end="0"/>
@@ -3183,6 +3147,50 @@
       </w:pPr>
       <w:r>
         <w:rPr/>
+      </w:r>
+    </w:p>
+    <w:p>
+      <w:pPr>
+        <w:pStyle w:val="normal1"/>
+        <w:widowControl/>
+        <w:shd w:val="clear" w:fill="auto"/>
+        <w:spacing w:lineRule="auto" w:line="240" w:before="0" w:after="0"/>
+        <w:ind w:hanging="0" w:start="1080" w:end="0"/>
+        <w:jc w:val="start"/>
+        <w:rPr/>
+      </w:pPr>
+      <w:r>
+        <w:rPr/>
+        <w:t>Current depth vector is measured in nanometers.</w:t>
+      </w:r>
+    </w:p>
+    <w:p>
+      <w:pPr>
+        <w:pStyle w:val="normal1"/>
+        <w:widowControl/>
+        <w:shd w:val="clear" w:fill="auto"/>
+        <w:spacing w:lineRule="auto" w:line="240" w:before="0" w:after="0"/>
+        <w:ind w:hanging="0" w:start="1080" w:end="0"/>
+        <w:jc w:val="start"/>
+        <w:rPr/>
+      </w:pPr>
+      <w:r>
+        <w:rPr/>
+      </w:r>
+    </w:p>
+    <w:p>
+      <w:pPr>
+        <w:pStyle w:val="normal1"/>
+        <w:widowControl/>
+        <w:shd w:val="clear" w:fill="auto"/>
+        <w:spacing w:lineRule="auto" w:line="240" w:before="0" w:after="0"/>
+        <w:ind w:hanging="0" w:start="1080" w:end="0"/>
+        <w:jc w:val="start"/>
+        <w:rPr/>
+      </w:pPr>
+      <w:r>
+        <w:rPr/>
+        <w:t>ISSUE: When graphing the output data, in case the NMAX barrier is crossed, graphing becomes hard because the first NMAX nodes take up very little space in comparison to the last 12 nodes, so we must still find a way to either interpolate the values, or something similar.</w:t>
       </w:r>
     </w:p>
     <w:p>
@@ -3196,7 +3204,6 @@
           <w:ilvl w:val="1"/>
           <w:numId w:val="4"/>
         </w:numPr>
-        <w:pBdr/>
         <w:shd w:val="clear" w:fill="auto"/>
         <w:spacing w:lineRule="auto" w:line="240" w:before="0" w:after="0"/>
         <w:ind w:hanging="360" w:start="1080" w:end="0"/>
@@ -3249,7 +3256,6 @@
         <w:keepLines w:val="false"/>
         <w:pageBreakBefore w:val="false"/>
         <w:widowControl/>
-        <w:pBdr/>
         <w:shd w:val="clear" w:fill="auto"/>
         <w:spacing w:lineRule="auto" w:line="240" w:before="0" w:after="0"/>
         <w:ind w:hanging="0" w:start="1080" w:end="0"/>
@@ -3322,7 +3328,6 @@
         <w:keepLines w:val="false"/>
         <w:pageBreakBefore w:val="false"/>
         <w:widowControl/>
-        <w:pBdr/>
         <w:shd w:val="clear" w:fill="auto"/>
         <w:spacing w:lineRule="auto" w:line="240" w:before="0" w:after="0"/>
         <w:ind w:hanging="0" w:start="1080" w:end="0"/>
@@ -3378,7 +3383,6 @@
           <w:ilvl w:val="1"/>
           <w:numId w:val="4"/>
         </w:numPr>
-        <w:pBdr/>
         <w:shd w:val="clear" w:fill="auto"/>
         <w:spacing w:lineRule="auto" w:line="240" w:before="0" w:after="0"/>
         <w:ind w:hanging="360" w:start="1080" w:end="0"/>
@@ -3471,7 +3475,6 @@
           <w:ilvl w:val="1"/>
           <w:numId w:val="4"/>
         </w:numPr>
-        <w:pBdr/>
         <w:shd w:val="clear" w:fill="auto"/>
         <w:spacing w:lineRule="auto" w:line="240" w:before="0" w:after="0"/>
         <w:ind w:hanging="360" w:start="1080" w:end="0"/>
@@ -3655,7 +3658,6 @@
           <w:ilvl w:val="1"/>
           <w:numId w:val="4"/>
         </w:numPr>
-        <w:pBdr/>
         <w:shd w:val="clear" w:fill="auto"/>
         <w:spacing w:lineRule="auto" w:line="240" w:before="0" w:after="0"/>
         <w:ind w:hanging="360" w:start="1080" w:end="0"/>
@@ -4858,6 +4860,7 @@
     <w:qFormat/>
     <w:pPr>
       <w:widowControl/>
+      <w:suppressAutoHyphens w:val="true"/>
       <w:bidi w:val="0"/>
       <w:spacing w:lineRule="auto" w:line="259" w:before="0" w:after="160"/>
       <w:jc w:val="start"/>
@@ -5042,6 +5045,7 @@
     <w:qFormat/>
     <w:pPr>
       <w:widowControl/>
+      <w:suppressAutoHyphens w:val="true"/>
       <w:bidi w:val="0"/>
       <w:spacing w:lineRule="auto" w:line="259" w:before="0" w:after="160"/>
       <w:jc w:val="start"/>
@@ -5092,6 +5096,13 @@
       <w:sz w:val="48"/>
       <w:szCs w:val="48"/>
     </w:rPr>
+  </w:style>
+  <w:style w:type="paragraph" w:styleId="FrameContentsuser">
+    <w:name w:val="Frame Contents (user)"/>
+    <w:basedOn w:val="Normal"/>
+    <w:qFormat/>
+    <w:pPr/>
+    <w:rPr/>
   </w:style>
   <w:style w:type="paragraph" w:styleId="FrameContents">
     <w:name w:val="Frame Contents"/>

</xml_diff>

<commit_message>
nice print message and updated doc
</commit_message>
<xml_diff>
--- a/status-quo-laser8-fs-Si_v2.docx
+++ b/status-quo-laser8-fs-Si_v2.docx
@@ -394,7 +394,7 @@
                   </pic:nvPicPr>
                   <pic:blipFill>
                     <a:blip r:embed="rId5"/>
-                    <a:srcRect l="55764" t="18998" r="1598" b="0"/>
+                    <a:srcRect l="55756" t="18998" r="1598" b="0"/>
                     <a:stretch>
                       <a:fillRect/>
                     </a:stretch>
@@ -1391,7 +1391,7 @@
                         <w:txbxContent>
                           <w:p>
                             <w:pPr>
-                              <w:pStyle w:val="FrameContentsuser"/>
+                              <w:pStyle w:val="FrameContents"/>
                               <w:spacing w:lineRule="auto" w:line="259" w:before="0" w:after="160"/>
                               <w:ind w:hanging="0" w:start="0" w:end="0"/>
                               <w:jc w:val="start"/>
@@ -1434,7 +1434,7 @@
                   <w:txbxContent>
                     <w:p>
                       <w:pPr>
-                        <w:pStyle w:val="FrameContentsuser"/>
+                        <w:pStyle w:val="FrameContents"/>
                         <w:spacing w:lineRule="auto" w:line="259" w:before="0" w:after="160"/>
                         <w:ind w:hanging="0" w:start="0" w:end="0"/>
                         <w:jc w:val="start"/>
@@ -3370,6 +3370,384 @@
       <w:r>
         <w:rPr/>
         <w:t>Currentlly for both heatmap and state_visualization, scale is in Depth(nanometers) and Time(nanoseconds)</w:t>
+      </w:r>
+    </w:p>
+    <w:p>
+      <w:pPr>
+        <w:pStyle w:val="normal1"/>
+        <w:spacing w:lineRule="auto" w:line="240" w:before="0" w:after="0"/>
+        <w:ind w:hanging="360" w:start="1440"/>
+        <w:rPr>
+          <w:u w:val="none"/>
+        </w:rPr>
+      </w:pPr>
+      <w:r>
+        <w:rPr>
+          <w:u w:val="none"/>
+        </w:rPr>
+      </w:r>
+    </w:p>
+    <w:p>
+      <w:pPr>
+        <w:pStyle w:val="normal1"/>
+        <w:spacing w:lineRule="auto" w:line="240" w:before="0" w:after="0"/>
+        <w:ind w:hanging="360" w:start="1440"/>
+        <w:rPr>
+          <w:u w:val="none"/>
+        </w:rPr>
+      </w:pPr>
+      <w:r>
+        <w:rPr>
+          <w:u w:val="none"/>
+        </w:rPr>
+        <w:t>IMPORTANT FOR BOTH FILES:</w:t>
+      </w:r>
+    </w:p>
+    <w:p>
+      <w:pPr>
+        <w:pStyle w:val="normal1"/>
+        <w:spacing w:lineRule="auto" w:line="240" w:before="0" w:after="0"/>
+        <w:ind w:hanging="360" w:start="1440"/>
+        <w:rPr>
+          <w:u w:val="none"/>
+        </w:rPr>
+      </w:pPr>
+      <w:r>
+        <w:rPr>
+          <w:u w:val="none"/>
+        </w:rPr>
+        <w:t>You can specify custom ranges for both depth and time, the following variables are used to set it</w:t>
+      </w:r>
+    </w:p>
+    <w:p>
+      <w:pPr>
+        <w:pStyle w:val="normal1"/>
+        <w:spacing w:lineRule="auto" w:line="240" w:before="0" w:after="0"/>
+        <w:ind w:hanging="360" w:start="1440"/>
+        <w:rPr>
+          <w:u w:val="none"/>
+        </w:rPr>
+      </w:pPr>
+      <w:r>
+        <w:rPr>
+          <w:u w:val="none"/>
+        </w:rPr>
+      </w:r>
+    </w:p>
+    <w:p>
+      <w:pPr>
+        <w:pStyle w:val="Normal"/>
+        <w:spacing w:lineRule="auto" w:line="240" w:before="0" w:after="0"/>
+        <w:ind w:hanging="0" w:start="1080"/>
+        <w:rPr>
+          <w:u w:val="none"/>
+        </w:rPr>
+      </w:pPr>
+      <w:r>
+        <w:rPr>
+          <w:rFonts w:ascii="Consolas;Courier New;monospace" w:hAnsi="Consolas;Courier New;monospace"/>
+          <w:b w:val="false"/>
+          <w:color w:val="FF7EDB"/>
+          <w:sz w:val="21"/>
+          <w:u w:val="none"/>
+          <w:shd w:fill="262335" w:val="clear"/>
+        </w:rPr>
+      </w:r>
+    </w:p>
+    <w:p>
+      <w:pPr>
+        <w:pStyle w:val="Normal"/>
+        <w:spacing w:lineRule="auto" w:line="240" w:before="0" w:after="0"/>
+        <w:ind w:hanging="0" w:start="0"/>
+        <w:rPr>
+          <w:u w:val="none"/>
+        </w:rPr>
+      </w:pPr>
+      <w:r>
+        <w:rPr>
+          <w:rFonts w:ascii="Consolas;Courier New;monospace" w:hAnsi="Consolas;Courier New;monospace"/>
+          <w:b w:val="false"/>
+          <w:color w:val="FF7EDB"/>
+          <w:sz w:val="21"/>
+          <w:u w:val="none"/>
+          <w:shd w:fill="262335" w:val="clear"/>
+        </w:rPr>
+        <w:tab/>
+        <w:tab/>
+        <w:t xml:space="preserve">DEPTH_MIN </w:t>
+      </w:r>
+      <w:r>
+        <w:rPr>
+          <w:rFonts w:ascii="Consolas;Courier New;monospace" w:hAnsi="Consolas;Courier New;monospace"/>
+          <w:b w:val="false"/>
+          <w:color w:val="FFFFFF"/>
+          <w:sz w:val="21"/>
+          <w:u w:val="none"/>
+          <w:shd w:fill="262335" w:val="clear"/>
+        </w:rPr>
+        <w:t>=</w:t>
+      </w:r>
+      <w:r>
+        <w:rPr>
+          <w:rFonts w:ascii="Consolas;Courier New;monospace" w:hAnsi="Consolas;Courier New;monospace"/>
+          <w:b w:val="false"/>
+          <w:color w:val="FF7EDB"/>
+          <w:sz w:val="21"/>
+          <w:u w:val="none"/>
+          <w:shd w:fill="262335" w:val="clear"/>
+        </w:rPr>
+        <w:t xml:space="preserve"> </w:t>
+      </w:r>
+      <w:r>
+        <w:rPr>
+          <w:rFonts w:ascii="Consolas;Courier New;monospace" w:hAnsi="Consolas;Courier New;monospace"/>
+          <w:b w:val="false"/>
+          <w:color w:val="FEDE5D"/>
+          <w:sz w:val="21"/>
+          <w:u w:val="none"/>
+          <w:shd w:fill="262335" w:val="clear"/>
+        </w:rPr>
+        <w:t>-</w:t>
+      </w:r>
+      <w:r>
+        <w:rPr>
+          <w:rFonts w:ascii="Consolas;Courier New;monospace" w:hAnsi="Consolas;Courier New;monospace"/>
+          <w:b w:val="false"/>
+          <w:color w:val="F97E72"/>
+          <w:sz w:val="21"/>
+          <w:u w:val="none"/>
+          <w:shd w:fill="262335" w:val="clear"/>
+        </w:rPr>
+        <w:t>1</w:t>
+      </w:r>
+    </w:p>
+    <w:p>
+      <w:pPr>
+        <w:pStyle w:val="Normal"/>
+        <w:spacing w:lineRule="atLeast" w:line="285" w:before="0" w:after="0"/>
+        <w:ind w:hanging="0" w:start="0" w:end="0"/>
+        <w:rPr>
+          <w:rFonts w:ascii="Consolas;Courier New;monospace" w:hAnsi="Consolas;Courier New;monospace"/>
+          <w:b w:val="false"/>
+          <w:color w:val="BBBBBB"/>
+          <w:sz w:val="21"/>
+          <w:shd w:fill="262335" w:val="clear"/>
+        </w:rPr>
+      </w:pPr>
+      <w:r>
+        <w:rPr>
+          <w:rFonts w:ascii="Consolas;Courier New;monospace" w:hAnsi="Consolas;Courier New;monospace"/>
+          <w:b w:val="false"/>
+          <w:color w:val="FF7EDB"/>
+          <w:sz w:val="21"/>
+          <w:shd w:fill="262335" w:val="clear"/>
+        </w:rPr>
+        <w:tab/>
+        <w:tab/>
+        <w:t xml:space="preserve">DEPTH_MAX </w:t>
+      </w:r>
+      <w:r>
+        <w:rPr>
+          <w:rFonts w:ascii="Consolas;Courier New;monospace" w:hAnsi="Consolas;Courier New;monospace"/>
+          <w:b w:val="false"/>
+          <w:color w:val="FFFFFF"/>
+          <w:sz w:val="21"/>
+          <w:shd w:fill="262335" w:val="clear"/>
+        </w:rPr>
+        <w:t>=</w:t>
+      </w:r>
+      <w:r>
+        <w:rPr>
+          <w:rFonts w:ascii="Consolas;Courier New;monospace" w:hAnsi="Consolas;Courier New;monospace"/>
+          <w:b w:val="false"/>
+          <w:color w:val="FF7EDB"/>
+          <w:sz w:val="21"/>
+          <w:shd w:fill="262335" w:val="clear"/>
+        </w:rPr>
+        <w:t xml:space="preserve"> </w:t>
+      </w:r>
+      <w:r>
+        <w:rPr>
+          <w:rFonts w:ascii="Consolas;Courier New;monospace" w:hAnsi="Consolas;Courier New;monospace"/>
+          <w:b w:val="false"/>
+          <w:color w:val="FEDE5D"/>
+          <w:sz w:val="21"/>
+          <w:shd w:fill="262335" w:val="clear"/>
+        </w:rPr>
+        <w:t>-</w:t>
+      </w:r>
+      <w:r>
+        <w:rPr>
+          <w:rFonts w:ascii="Consolas;Courier New;monospace" w:hAnsi="Consolas;Courier New;monospace"/>
+          <w:b w:val="false"/>
+          <w:color w:val="F97E72"/>
+          <w:sz w:val="21"/>
+          <w:shd w:fill="262335" w:val="clear"/>
+        </w:rPr>
+        <w:t>1</w:t>
+      </w:r>
+    </w:p>
+    <w:p>
+      <w:pPr>
+        <w:pStyle w:val="Normal"/>
+        <w:spacing w:lineRule="atLeast" w:line="285" w:before="0" w:after="0"/>
+        <w:ind w:hanging="0" w:start="0" w:end="0"/>
+        <w:rPr>
+          <w:rFonts w:ascii="Consolas;Courier New;monospace" w:hAnsi="Consolas;Courier New;monospace"/>
+          <w:b w:val="false"/>
+          <w:color w:val="BBBBBB"/>
+          <w:sz w:val="21"/>
+          <w:shd w:fill="262335" w:val="clear"/>
+        </w:rPr>
+      </w:pPr>
+      <w:r>
+        <w:rPr>
+          <w:rFonts w:ascii="Consolas;Courier New;monospace" w:hAnsi="Consolas;Courier New;monospace"/>
+          <w:b w:val="false"/>
+          <w:color w:val="FF7EDB"/>
+          <w:sz w:val="21"/>
+          <w:shd w:fill="262335" w:val="clear"/>
+        </w:rPr>
+        <w:tab/>
+        <w:tab/>
+        <w:t xml:space="preserve">TIME_MIN </w:t>
+      </w:r>
+      <w:r>
+        <w:rPr>
+          <w:rFonts w:ascii="Consolas;Courier New;monospace" w:hAnsi="Consolas;Courier New;monospace"/>
+          <w:b w:val="false"/>
+          <w:color w:val="FFFFFF"/>
+          <w:sz w:val="21"/>
+          <w:shd w:fill="262335" w:val="clear"/>
+        </w:rPr>
+        <w:t>=</w:t>
+      </w:r>
+      <w:r>
+        <w:rPr>
+          <w:rFonts w:ascii="Consolas;Courier New;monospace" w:hAnsi="Consolas;Courier New;monospace"/>
+          <w:b w:val="false"/>
+          <w:color w:val="FF7EDB"/>
+          <w:sz w:val="21"/>
+          <w:shd w:fill="262335" w:val="clear"/>
+        </w:rPr>
+        <w:t xml:space="preserve"> </w:t>
+      </w:r>
+      <w:r>
+        <w:rPr>
+          <w:rFonts w:ascii="Consolas;Courier New;monospace" w:hAnsi="Consolas;Courier New;monospace"/>
+          <w:b w:val="false"/>
+          <w:color w:val="FEDE5D"/>
+          <w:sz w:val="21"/>
+          <w:shd w:fill="262335" w:val="clear"/>
+        </w:rPr>
+        <w:t>-</w:t>
+      </w:r>
+      <w:r>
+        <w:rPr>
+          <w:rFonts w:ascii="Consolas;Courier New;monospace" w:hAnsi="Consolas;Courier New;monospace"/>
+          <w:b w:val="false"/>
+          <w:color w:val="F97E72"/>
+          <w:sz w:val="21"/>
+          <w:shd w:fill="262335" w:val="clear"/>
+        </w:rPr>
+        <w:t>1</w:t>
+      </w:r>
+    </w:p>
+    <w:p>
+      <w:pPr>
+        <w:pStyle w:val="Normal"/>
+        <w:spacing w:lineRule="atLeast" w:line="285" w:before="0" w:after="0"/>
+        <w:ind w:hanging="0" w:start="0" w:end="0"/>
+        <w:rPr>
+          <w:rFonts w:ascii="Consolas;Courier New;monospace" w:hAnsi="Consolas;Courier New;monospace"/>
+          <w:b w:val="false"/>
+          <w:color w:val="BBBBBB"/>
+          <w:sz w:val="21"/>
+          <w:shd w:fill="262335" w:val="clear"/>
+        </w:rPr>
+      </w:pPr>
+      <w:r>
+        <w:rPr>
+          <w:rFonts w:ascii="Consolas;Courier New;monospace" w:hAnsi="Consolas;Courier New;monospace"/>
+          <w:b w:val="false"/>
+          <w:color w:val="FF7EDB"/>
+          <w:sz w:val="21"/>
+          <w:shd w:fill="262335" w:val="clear"/>
+        </w:rPr>
+        <w:tab/>
+        <w:tab/>
+        <w:t xml:space="preserve">TIME_MAX </w:t>
+      </w:r>
+      <w:r>
+        <w:rPr>
+          <w:rFonts w:ascii="Consolas;Courier New;monospace" w:hAnsi="Consolas;Courier New;monospace"/>
+          <w:b w:val="false"/>
+          <w:color w:val="FFFFFF"/>
+          <w:sz w:val="21"/>
+          <w:shd w:fill="262335" w:val="clear"/>
+        </w:rPr>
+        <w:t>=</w:t>
+      </w:r>
+      <w:r>
+        <w:rPr>
+          <w:rFonts w:ascii="Consolas;Courier New;monospace" w:hAnsi="Consolas;Courier New;monospace"/>
+          <w:b w:val="false"/>
+          <w:color w:val="FF7EDB"/>
+          <w:sz w:val="21"/>
+          <w:shd w:fill="262335" w:val="clear"/>
+        </w:rPr>
+        <w:t xml:space="preserve"> </w:t>
+      </w:r>
+      <w:r>
+        <w:rPr>
+          <w:rFonts w:ascii="Consolas;Courier New;monospace" w:hAnsi="Consolas;Courier New;monospace"/>
+          <w:b w:val="false"/>
+          <w:color w:val="FEDE5D"/>
+          <w:sz w:val="21"/>
+          <w:shd w:fill="262335" w:val="clear"/>
+        </w:rPr>
+        <w:t>-</w:t>
+      </w:r>
+      <w:r>
+        <w:rPr>
+          <w:rFonts w:ascii="Consolas;Courier New;monospace" w:hAnsi="Consolas;Courier New;monospace"/>
+          <w:b w:val="false"/>
+          <w:color w:val="F97E72"/>
+          <w:sz w:val="21"/>
+          <w:shd w:fill="262335" w:val="clear"/>
+        </w:rPr>
+        <w:t>1</w:t>
+      </w:r>
+    </w:p>
+    <w:p>
+      <w:pPr>
+        <w:pStyle w:val="normal1"/>
+        <w:spacing w:lineRule="auto" w:line="240" w:before="0" w:after="0"/>
+        <w:ind w:hanging="360" w:start="1440"/>
+        <w:rPr>
+          <w:u w:val="none"/>
+        </w:rPr>
+      </w:pPr>
+      <w:r>
+        <w:rPr>
+          <w:u w:val="none"/>
+        </w:rPr>
+      </w:r>
+    </w:p>
+    <w:p>
+      <w:pPr>
+        <w:pStyle w:val="normal1"/>
+        <w:spacing w:lineRule="auto" w:line="240" w:before="0" w:after="0"/>
+        <w:ind w:hanging="360" w:start="1440"/>
+        <w:rPr>
+          <w:u w:val="none"/>
+        </w:rPr>
+      </w:pPr>
+      <w:r>
+        <w:rPr>
+          <w:u w:val="none"/>
+        </w:rPr>
+        <w:t>When the value is set to -1, it will just fetch the minimum and maximum values found in the data. Please note that this will only affect the linear plot, not the exponential plot found on the right hand side.</w:t>
       </w:r>
     </w:p>
     <w:p>
@@ -5097,15 +5475,15 @@
       <w:szCs w:val="48"/>
     </w:rPr>
   </w:style>
-  <w:style w:type="paragraph" w:styleId="FrameContentsuser">
-    <w:name w:val="Frame Contents (user)"/>
+  <w:style w:type="paragraph" w:styleId="FrameContents">
+    <w:name w:val="Frame Contents"/>
     <w:basedOn w:val="Normal"/>
     <w:qFormat/>
     <w:pPr/>
     <w:rPr/>
   </w:style>
-  <w:style w:type="paragraph" w:styleId="FrameContents">
-    <w:name w:val="Frame Contents"/>
+  <w:style w:type="paragraph" w:styleId="FrameContentsuser">
+    <w:name w:val="Frame Contents (user)"/>
     <w:basedOn w:val="Normal"/>
     <w:qFormat/>
     <w:pPr/>

</xml_diff>